<commit_message>
Manuscript: lineage from Tommelein Parade of Trades and differentiation
State development basis, comparison table, and strengths vs original software.
</commit_message>
<xml_diff>
--- a/SOFTWARE_IMPACTS_OSP_Draft.docx
+++ b/SOFTWARE_IMPACTS_OSP_Draft.docx
@@ -19,7 +19,7 @@
     </w:p>
     <w:p>
       <w:pPr>
-        <w:spacing w:after="240" w:before="0" w:line="276" w:lineRule="auto"/>
+        <w:spacing w:after="200" w:before="0" w:line="276" w:lineRule="auto"/>
         <w:jc w:val="center"/>
       </w:pPr>
       <w:r>
@@ -29,12 +29,12 @@
           <w:i/>
           <w:sz w:val="18"/>
         </w:rPr>
-        <w:t>Prepared for transfer into Elsevier SIMPAC_OSP_Template.docx · Edit all [PLACEHOLDER] fields before submission</w:t>
+        <w:t>Includes lineage from Tommelein Parade of Trades and differentiation table · Edit [PLACEHOLDER] fields</w:t>
       </w:r>
     </w:p>
     <w:p>
       <w:pPr>
-        <w:spacing w:after="240" w:before="0" w:line="276" w:lineRule="auto"/>
+        <w:spacing w:after="200" w:before="0" w:line="276" w:lineRule="auto"/>
         <w:jc w:val="center"/>
       </w:pPr>
       <w:r>
@@ -74,12 +74,12 @@
           <w:i/>
           <w:sz w:val="20"/>
         </w:rPr>
-        <w:t>a [Department], [Faculty], [University], [Street address], [City], [Postal code], [Country]</w:t>
+        <w:t>a [Department], [Faculty], [University], [City], [Country]</w:t>
       </w:r>
     </w:p>
     <w:p>
       <w:pPr>
-        <w:spacing w:after="240" w:before="0" w:line="276" w:lineRule="auto"/>
+        <w:spacing w:after="200" w:before="0" w:line="276" w:lineRule="auto"/>
         <w:jc w:val="center"/>
       </w:pPr>
       <w:r>
@@ -89,7 +89,7 @@
           <w:i w:val="0"/>
           <w:sz w:val="20"/>
         </w:rPr>
-        <w:t>* Corresponding author. E-mail address: [email@institution.edu] (G. Familyname).</w:t>
+        <w:t>* Corresponding author. E-mail address: [email@institution.edu].</w:t>
       </w:r>
     </w:p>
     <w:p>
@@ -108,7 +108,7 @@
     </w:p>
     <w:p>
       <w:pPr>
-        <w:spacing w:after="160" w:before="0" w:line="276" w:lineRule="auto"/>
+        <w:spacing w:after="120" w:before="0" w:line="276" w:lineRule="auto"/>
       </w:pPr>
       <w:r>
         <w:rPr>
@@ -117,12 +117,12 @@
           <w:i w:val="0"/>
           <w:sz w:val="20"/>
         </w:rPr>
-        <w:t>Parade Tim Kerja (“Work-Team Parade”) is an open-source, browser-based simulator for teaching and exploring project-production behaviour in construction. The tool implements a zone-flow parade of trades model for a five-trade concrete floor cycle: sequential crews advance across spatial zones under capacity limits, batch handoff policies, and optional per-zone production variability. Learners obtain Line of Balance charts, work-in-process (WIP) trajectories, utilisation, active/idle labour-cost metrics, and multi-scenario comparisons without installing local software. Built-in analytics connect simulation outcomes to Little’s Law, Kingman’s VUT approximation, inventory–fill-rate trade-offs, and an educational takt-planning module that separates physical bays from planning zones on a fixed floor area. Results export to CSV/Excel for classroom reporting. The software is implemented in Python with a Streamlit interface, documented with an Indonesian teaching manual, and released publicly for reuse in civil engineering education, Lean Construction workshops, and reproducible classroom experiments on workflow variability and handoff batch size.</w:t>
+        <w:t>Parade Tim Kerja (“Work-Team Parade”) is an open-source, browser-based simulator for teaching and exploring project-production behaviour in construction. Building on the Parade of Trades / Parade Game tradition of Tommelein and colleagues—including the computer-based Parade of Trades implementation—the tool implements a zone-flow parade of trades model for a five-trade concrete floor cycle: sequential crews advance across spatial zones under capacity limits, batch handoff policies, and optional per-zone production variability. Relative to the original teaching game and legacy Visual Basic software, Parade Tim Kerja adds open web delivery, Line of Balance, WIP and utilisation analytics, active/idle labour costing, multi-scenario comparison, Factory Physics–style theory links (Little’s Law, Kingman/VUT, inventory–fill rate), and an educational takt module that separates physical bays from planning zones. Results export to CSV/Excel. The software uses Python and Streamlit, ships with an Indonesian teaching manual, and is released for civil engineering education, Lean Construction workshops, and reproducible classroom experiments.</w:t>
       </w:r>
     </w:p>
     <w:p>
       <w:pPr>
-        <w:spacing w:after="240" w:before="0" w:line="276" w:lineRule="auto"/>
+        <w:spacing w:after="200" w:before="0" w:line="276" w:lineRule="auto"/>
       </w:pPr>
       <w:r>
         <w:rPr>
@@ -146,20 +146,6 @@
           <w:sz w:val="24"/>
         </w:rPr>
         <w:t>Code metadata</w:t>
-      </w:r>
-    </w:p>
-    <w:p>
-      <w:pPr>
-        <w:spacing w:after="120" w:before="0" w:line="276" w:lineRule="auto"/>
-      </w:pPr>
-      <w:r>
-        <w:rPr>
-          <w:rFonts w:ascii="Times New Roman" w:hAnsi="Times New Roman" w:eastAsia="Times New Roman"/>
-          <w:b w:val="0"/>
-          <w:i w:val="0"/>
-          <w:sz w:val="20"/>
-        </w:rPr>
-        <w:t>Table 1 summarises code metadata required by Software Impacts Original Software Publications.</w:t>
       </w:r>
     </w:p>
     <w:p>
@@ -190,7 +176,7 @@
       <w:tr>
         <w:tc>
           <w:tcPr>
-            <w:tcW w:type="dxa" w:w="680"/>
+            <w:tcW w:type="dxa" w:w="3213"/>
           </w:tcPr>
           <w:p>
             <w:r/>
@@ -199,7 +185,7 @@
                 <w:rFonts w:ascii="Times New Roman" w:hAnsi="Times New Roman" w:eastAsia="Times New Roman"/>
                 <w:b/>
                 <w:i w:val="0"/>
-                <w:sz w:val="18"/>
+                <w:sz w:val="16"/>
               </w:rPr>
               <w:t>Nr</w:t>
             </w:r>
@@ -207,7 +193,7 @@
         </w:tc>
         <w:tc>
           <w:tcPr>
-            <w:tcW w:type="dxa" w:w="3685"/>
+            <w:tcW w:type="dxa" w:w="3213"/>
           </w:tcPr>
           <w:p>
             <w:r/>
@@ -216,7 +202,7 @@
                 <w:rFonts w:ascii="Times New Roman" w:hAnsi="Times New Roman" w:eastAsia="Times New Roman"/>
                 <w:b/>
                 <w:i w:val="0"/>
-                <w:sz w:val="18"/>
+                <w:sz w:val="16"/>
               </w:rPr>
               <w:t>Code metadata description</w:t>
             </w:r>
@@ -224,7 +210,7 @@
         </w:tc>
         <w:tc>
           <w:tcPr>
-            <w:tcW w:type="dxa" w:w="4819"/>
+            <w:tcW w:type="dxa" w:w="3213"/>
           </w:tcPr>
           <w:p>
             <w:r/>
@@ -233,7 +219,7 @@
                 <w:rFonts w:ascii="Times New Roman" w:hAnsi="Times New Roman" w:eastAsia="Times New Roman"/>
                 <w:b/>
                 <w:i w:val="0"/>
-                <w:sz w:val="18"/>
+                <w:sz w:val="16"/>
               </w:rPr>
               <w:t>Please fill in this column</w:t>
             </w:r>
@@ -243,7 +229,7 @@
       <w:tr>
         <w:tc>
           <w:tcPr>
-            <w:tcW w:type="dxa" w:w="680"/>
+            <w:tcW w:type="dxa" w:w="3213"/>
           </w:tcPr>
           <w:p>
             <w:r/>
@@ -252,7 +238,7 @@
                 <w:rFonts w:ascii="Times New Roman" w:hAnsi="Times New Roman" w:eastAsia="Times New Roman"/>
                 <w:b w:val="0"/>
                 <w:i w:val="0"/>
-                <w:sz w:val="18"/>
+                <w:sz w:val="16"/>
               </w:rPr>
               <w:t>C1</w:t>
             </w:r>
@@ -260,7 +246,7 @@
         </w:tc>
         <w:tc>
           <w:tcPr>
-            <w:tcW w:type="dxa" w:w="3685"/>
+            <w:tcW w:type="dxa" w:w="3213"/>
           </w:tcPr>
           <w:p>
             <w:r/>
@@ -269,7 +255,7 @@
                 <w:rFonts w:ascii="Times New Roman" w:hAnsi="Times New Roman" w:eastAsia="Times New Roman"/>
                 <w:b w:val="0"/>
                 <w:i w:val="0"/>
-                <w:sz w:val="18"/>
+                <w:sz w:val="16"/>
               </w:rPr>
               <w:t>Current code version</w:t>
             </w:r>
@@ -277,7 +263,7 @@
         </w:tc>
         <w:tc>
           <w:tcPr>
-            <w:tcW w:type="dxa" w:w="4819"/>
+            <w:tcW w:type="dxa" w:w="3213"/>
           </w:tcPr>
           <w:p>
             <w:r/>
@@ -286,7 +272,7 @@
                 <w:rFonts w:ascii="Times New Roman" w:hAnsi="Times New Roman" w:eastAsia="Times New Roman"/>
                 <w:b w:val="0"/>
                 <w:i w:val="0"/>
-                <w:sz w:val="18"/>
+                <w:sz w:val="16"/>
               </w:rPr>
               <w:t>[e.g. v1.0.0]</w:t>
             </w:r>
@@ -296,7 +282,7 @@
       <w:tr>
         <w:tc>
           <w:tcPr>
-            <w:tcW w:type="dxa" w:w="680"/>
+            <w:tcW w:type="dxa" w:w="3213"/>
           </w:tcPr>
           <w:p>
             <w:r/>
@@ -305,7 +291,7 @@
                 <w:rFonts w:ascii="Times New Roman" w:hAnsi="Times New Roman" w:eastAsia="Times New Roman"/>
                 <w:b w:val="0"/>
                 <w:i w:val="0"/>
-                <w:sz w:val="18"/>
+                <w:sz w:val="16"/>
               </w:rPr>
               <w:t>C2</w:t>
             </w:r>
@@ -313,7 +299,7 @@
         </w:tc>
         <w:tc>
           <w:tcPr>
-            <w:tcW w:type="dxa" w:w="3685"/>
+            <w:tcW w:type="dxa" w:w="3213"/>
           </w:tcPr>
           <w:p>
             <w:r/>
@@ -322,15 +308,15 @@
                 <w:rFonts w:ascii="Times New Roman" w:hAnsi="Times New Roman" w:eastAsia="Times New Roman"/>
                 <w:b w:val="0"/>
                 <w:i w:val="0"/>
-                <w:sz w:val="18"/>
+                <w:sz w:val="16"/>
               </w:rPr>
-              <w:t>Permanent link to code/repository used for this code version</w:t>
+              <w:t>Permanent link to code/repository</w:t>
             </w:r>
           </w:p>
         </w:tc>
         <w:tc>
           <w:tcPr>
-            <w:tcW w:type="dxa" w:w="4819"/>
+            <w:tcW w:type="dxa" w:w="3213"/>
           </w:tcPr>
           <w:p>
             <w:r/>
@@ -339,7 +325,7 @@
                 <w:rFonts w:ascii="Times New Roman" w:hAnsi="Times New Roman" w:eastAsia="Times New Roman"/>
                 <w:b w:val="0"/>
                 <w:i w:val="0"/>
-                <w:sz w:val="18"/>
+                <w:sz w:val="16"/>
               </w:rPr>
               <w:t>https://github.com/m46d45/Parade-Tim-Kerja</w:t>
             </w:r>
@@ -349,7 +335,7 @@
       <w:tr>
         <w:tc>
           <w:tcPr>
-            <w:tcW w:type="dxa" w:w="680"/>
+            <w:tcW w:type="dxa" w:w="3213"/>
           </w:tcPr>
           <w:p>
             <w:r/>
@@ -358,7 +344,7 @@
                 <w:rFonts w:ascii="Times New Roman" w:hAnsi="Times New Roman" w:eastAsia="Times New Roman"/>
                 <w:b w:val="0"/>
                 <w:i w:val="0"/>
-                <w:sz w:val="18"/>
+                <w:sz w:val="16"/>
               </w:rPr>
               <w:t>C3</w:t>
             </w:r>
@@ -366,7 +352,7 @@
         </w:tc>
         <w:tc>
           <w:tcPr>
-            <w:tcW w:type="dxa" w:w="3685"/>
+            <w:tcW w:type="dxa" w:w="3213"/>
           </w:tcPr>
           <w:p>
             <w:r/>
@@ -375,15 +361,15 @@
                 <w:rFonts w:ascii="Times New Roman" w:hAnsi="Times New Roman" w:eastAsia="Times New Roman"/>
                 <w:b w:val="0"/>
                 <w:i w:val="0"/>
-                <w:sz w:val="18"/>
+                <w:sz w:val="16"/>
               </w:rPr>
-              <w:t>Permanent link to Reproducible Capsule (CodeOcean, optional)</w:t>
+              <w:t>Reproducible Capsule (CodeOcean, optional)</w:t>
             </w:r>
           </w:p>
         </w:tc>
         <w:tc>
           <w:tcPr>
-            <w:tcW w:type="dxa" w:w="4819"/>
+            <w:tcW w:type="dxa" w:w="3213"/>
           </w:tcPr>
           <w:p>
             <w:r/>
@@ -392,7 +378,7 @@
                 <w:rFonts w:ascii="Times New Roman" w:hAnsi="Times New Roman" w:eastAsia="Times New Roman"/>
                 <w:b w:val="0"/>
                 <w:i w:val="0"/>
-                <w:sz w:val="18"/>
+                <w:sz w:val="16"/>
               </w:rPr>
               <w:t>[URL or N/A]</w:t>
             </w:r>
@@ -402,7 +388,7 @@
       <w:tr>
         <w:tc>
           <w:tcPr>
-            <w:tcW w:type="dxa" w:w="680"/>
+            <w:tcW w:type="dxa" w:w="3213"/>
           </w:tcPr>
           <w:p>
             <w:r/>
@@ -411,7 +397,7 @@
                 <w:rFonts w:ascii="Times New Roman" w:hAnsi="Times New Roman" w:eastAsia="Times New Roman"/>
                 <w:b w:val="0"/>
                 <w:i w:val="0"/>
-                <w:sz w:val="18"/>
+                <w:sz w:val="16"/>
               </w:rPr>
               <w:t>C4</w:t>
             </w:r>
@@ -419,7 +405,7 @@
         </w:tc>
         <w:tc>
           <w:tcPr>
-            <w:tcW w:type="dxa" w:w="3685"/>
+            <w:tcW w:type="dxa" w:w="3213"/>
           </w:tcPr>
           <w:p>
             <w:r/>
@@ -428,15 +414,15 @@
                 <w:rFonts w:ascii="Times New Roman" w:hAnsi="Times New Roman" w:eastAsia="Times New Roman"/>
                 <w:b w:val="0"/>
                 <w:i w:val="0"/>
-                <w:sz w:val="18"/>
+                <w:sz w:val="16"/>
               </w:rPr>
-              <w:t>Legal code licence (OSI-approved required)</w:t>
+              <w:t>Legal code licence (OSI-approved)</w:t>
             </w:r>
           </w:p>
         </w:tc>
         <w:tc>
           <w:tcPr>
-            <w:tcW w:type="dxa" w:w="4819"/>
+            <w:tcW w:type="dxa" w:w="3213"/>
           </w:tcPr>
           <w:p>
             <w:r/>
@@ -445,9 +431,9 @@
                 <w:rFonts w:ascii="Times New Roman" w:hAnsi="Times New Roman" w:eastAsia="Times New Roman"/>
                 <w:b w:val="0"/>
                 <w:i w:val="0"/>
-                <w:sz w:val="18"/>
+                <w:sz w:val="16"/>
               </w:rPr>
-              <w:t>[e.g. MIT — add LICENSE to repository]</w:t>
+              <w:t>[e.g. MIT]</w:t>
             </w:r>
           </w:p>
         </w:tc>
@@ -455,7 +441,7 @@
       <w:tr>
         <w:tc>
           <w:tcPr>
-            <w:tcW w:type="dxa" w:w="680"/>
+            <w:tcW w:type="dxa" w:w="3213"/>
           </w:tcPr>
           <w:p>
             <w:r/>
@@ -464,7 +450,7 @@
                 <w:rFonts w:ascii="Times New Roman" w:hAnsi="Times New Roman" w:eastAsia="Times New Roman"/>
                 <w:b w:val="0"/>
                 <w:i w:val="0"/>
-                <w:sz w:val="18"/>
+                <w:sz w:val="16"/>
               </w:rPr>
               <w:t>C5</w:t>
             </w:r>
@@ -472,7 +458,7 @@
         </w:tc>
         <w:tc>
           <w:tcPr>
-            <w:tcW w:type="dxa" w:w="3685"/>
+            <w:tcW w:type="dxa" w:w="3213"/>
           </w:tcPr>
           <w:p>
             <w:r/>
@@ -481,7 +467,7 @@
                 <w:rFonts w:ascii="Times New Roman" w:hAnsi="Times New Roman" w:eastAsia="Times New Roman"/>
                 <w:b w:val="0"/>
                 <w:i w:val="0"/>
-                <w:sz w:val="18"/>
+                <w:sz w:val="16"/>
               </w:rPr>
               <w:t>Code versioning system used</w:t>
             </w:r>
@@ -489,7 +475,7 @@
         </w:tc>
         <w:tc>
           <w:tcPr>
-            <w:tcW w:type="dxa" w:w="4819"/>
+            <w:tcW w:type="dxa" w:w="3213"/>
           </w:tcPr>
           <w:p>
             <w:r/>
@@ -498,7 +484,7 @@
                 <w:rFonts w:ascii="Times New Roman" w:hAnsi="Times New Roman" w:eastAsia="Times New Roman"/>
                 <w:b w:val="0"/>
                 <w:i w:val="0"/>
-                <w:sz w:val="18"/>
+                <w:sz w:val="16"/>
               </w:rPr>
               <w:t>git</w:t>
             </w:r>
@@ -508,7 +494,7 @@
       <w:tr>
         <w:tc>
           <w:tcPr>
-            <w:tcW w:type="dxa" w:w="680"/>
+            <w:tcW w:type="dxa" w:w="3213"/>
           </w:tcPr>
           <w:p>
             <w:r/>
@@ -517,7 +503,7 @@
                 <w:rFonts w:ascii="Times New Roman" w:hAnsi="Times New Roman" w:eastAsia="Times New Roman"/>
                 <w:b w:val="0"/>
                 <w:i w:val="0"/>
-                <w:sz w:val="18"/>
+                <w:sz w:val="16"/>
               </w:rPr>
               <w:t>C6</w:t>
             </w:r>
@@ -525,7 +511,7 @@
         </w:tc>
         <w:tc>
           <w:tcPr>
-            <w:tcW w:type="dxa" w:w="3685"/>
+            <w:tcW w:type="dxa" w:w="3213"/>
           </w:tcPr>
           <w:p>
             <w:r/>
@@ -534,15 +520,15 @@
                 <w:rFonts w:ascii="Times New Roman" w:hAnsi="Times New Roman" w:eastAsia="Times New Roman"/>
                 <w:b w:val="0"/>
                 <w:i w:val="0"/>
-                <w:sz w:val="18"/>
+                <w:sz w:val="16"/>
               </w:rPr>
-              <w:t>Software code languages, tools, and services used</w:t>
+              <w:t>Languages, tools, services</w:t>
             </w:r>
           </w:p>
         </w:tc>
         <w:tc>
           <w:tcPr>
-            <w:tcW w:type="dxa" w:w="4819"/>
+            <w:tcW w:type="dxa" w:w="3213"/>
           </w:tcPr>
           <w:p>
             <w:r/>
@@ -551,7 +537,7 @@
                 <w:rFonts w:ascii="Times New Roman" w:hAnsi="Times New Roman" w:eastAsia="Times New Roman"/>
                 <w:b w:val="0"/>
                 <w:i w:val="0"/>
-                <w:sz w:val="18"/>
+                <w:sz w:val="16"/>
               </w:rPr>
               <w:t>Python 3, Streamlit, matplotlib, NumPy, openpyxl</w:t>
             </w:r>
@@ -561,7 +547,7 @@
       <w:tr>
         <w:tc>
           <w:tcPr>
-            <w:tcW w:type="dxa" w:w="680"/>
+            <w:tcW w:type="dxa" w:w="3213"/>
           </w:tcPr>
           <w:p>
             <w:r/>
@@ -570,7 +556,7 @@
                 <w:rFonts w:ascii="Times New Roman" w:hAnsi="Times New Roman" w:eastAsia="Times New Roman"/>
                 <w:b w:val="0"/>
                 <w:i w:val="0"/>
-                <w:sz w:val="18"/>
+                <w:sz w:val="16"/>
               </w:rPr>
               <w:t>C7</w:t>
             </w:r>
@@ -578,7 +564,7 @@
         </w:tc>
         <w:tc>
           <w:tcPr>
-            <w:tcW w:type="dxa" w:w="3685"/>
+            <w:tcW w:type="dxa" w:w="3213"/>
           </w:tcPr>
           <w:p>
             <w:r/>
@@ -587,15 +573,15 @@
                 <w:rFonts w:ascii="Times New Roman" w:hAnsi="Times New Roman" w:eastAsia="Times New Roman"/>
                 <w:b w:val="0"/>
                 <w:i w:val="0"/>
-                <w:sz w:val="18"/>
+                <w:sz w:val="16"/>
               </w:rPr>
-              <w:t>Compilation requirements, operating environments &amp; dependencies</w:t>
+              <w:t>Requirements / environments</w:t>
             </w:r>
           </w:p>
         </w:tc>
         <w:tc>
           <w:tcPr>
-            <w:tcW w:type="dxa" w:w="4819"/>
+            <w:tcW w:type="dxa" w:w="3213"/>
           </w:tcPr>
           <w:p>
             <w:r/>
@@ -604,9 +590,9 @@
                 <w:rFonts w:ascii="Times New Roman" w:hAnsi="Times New Roman" w:eastAsia="Times New Roman"/>
                 <w:b w:val="0"/>
                 <w:i w:val="0"/>
-                <w:sz w:val="18"/>
+                <w:sz w:val="16"/>
               </w:rPr>
-              <w:t>Python ≥3.10; pip install -r requirements.txt; or Streamlit Community Cloud</w:t>
+              <w:t>Python ≥3.10; requirements.txt; or Streamlit Cloud</w:t>
             </w:r>
           </w:p>
         </w:tc>
@@ -614,7 +600,7 @@
       <w:tr>
         <w:tc>
           <w:tcPr>
-            <w:tcW w:type="dxa" w:w="680"/>
+            <w:tcW w:type="dxa" w:w="3213"/>
           </w:tcPr>
           <w:p>
             <w:r/>
@@ -623,7 +609,7 @@
                 <w:rFonts w:ascii="Times New Roman" w:hAnsi="Times New Roman" w:eastAsia="Times New Roman"/>
                 <w:b w:val="0"/>
                 <w:i w:val="0"/>
-                <w:sz w:val="18"/>
+                <w:sz w:val="16"/>
               </w:rPr>
               <w:t>C8</w:t>
             </w:r>
@@ -631,7 +617,7 @@
         </w:tc>
         <w:tc>
           <w:tcPr>
-            <w:tcW w:type="dxa" w:w="3685"/>
+            <w:tcW w:type="dxa" w:w="3213"/>
           </w:tcPr>
           <w:p>
             <w:r/>
@@ -640,15 +626,15 @@
                 <w:rFonts w:ascii="Times New Roman" w:hAnsi="Times New Roman" w:eastAsia="Times New Roman"/>
                 <w:b w:val="0"/>
                 <w:i w:val="0"/>
-                <w:sz w:val="18"/>
+                <w:sz w:val="16"/>
               </w:rPr>
-              <w:t>If available, link to developer documentation/manual</w:t>
+              <w:t>Documentation / manual</w:t>
             </w:r>
           </w:p>
         </w:tc>
         <w:tc>
           <w:tcPr>
-            <w:tcW w:type="dxa" w:w="4819"/>
+            <w:tcW w:type="dxa" w:w="3213"/>
           </w:tcPr>
           <w:p>
             <w:r/>
@@ -657,9 +643,9 @@
                 <w:rFonts w:ascii="Times New Roman" w:hAnsi="Times New Roman" w:eastAsia="Times New Roman"/>
                 <w:b w:val="0"/>
                 <w:i w:val="0"/>
-                <w:sz w:val="18"/>
+                <w:sz w:val="16"/>
               </w:rPr>
-              <w:t>MANUAL.md in repository; in-app Manual tab</w:t>
+              <w:t>MANUAL.md; in-app Manual tab</w:t>
             </w:r>
           </w:p>
         </w:tc>
@@ -667,7 +653,7 @@
       <w:tr>
         <w:tc>
           <w:tcPr>
-            <w:tcW w:type="dxa" w:w="680"/>
+            <w:tcW w:type="dxa" w:w="3213"/>
           </w:tcPr>
           <w:p>
             <w:r/>
@@ -676,7 +662,7 @@
                 <w:rFonts w:ascii="Times New Roman" w:hAnsi="Times New Roman" w:eastAsia="Times New Roman"/>
                 <w:b w:val="0"/>
                 <w:i w:val="0"/>
-                <w:sz w:val="18"/>
+                <w:sz w:val="16"/>
               </w:rPr>
               <w:t>C9</w:t>
             </w:r>
@@ -684,7 +670,7 @@
         </w:tc>
         <w:tc>
           <w:tcPr>
-            <w:tcW w:type="dxa" w:w="3685"/>
+            <w:tcW w:type="dxa" w:w="3213"/>
           </w:tcPr>
           <w:p>
             <w:r/>
@@ -693,15 +679,15 @@
                 <w:rFonts w:ascii="Times New Roman" w:hAnsi="Times New Roman" w:eastAsia="Times New Roman"/>
                 <w:b w:val="0"/>
                 <w:i w:val="0"/>
-                <w:sz w:val="18"/>
+                <w:sz w:val="16"/>
               </w:rPr>
-              <w:t>Support email for questions</w:t>
+              <w:t>Support email</w:t>
             </w:r>
           </w:p>
         </w:tc>
         <w:tc>
           <w:tcPr>
-            <w:tcW w:type="dxa" w:w="4819"/>
+            <w:tcW w:type="dxa" w:w="3213"/>
           </w:tcPr>
           <w:p>
             <w:r/>
@@ -710,7 +696,7 @@
                 <w:rFonts w:ascii="Times New Roman" w:hAnsi="Times New Roman" w:eastAsia="Times New Roman"/>
                 <w:b w:val="0"/>
                 <w:i w:val="0"/>
-                <w:sz w:val="18"/>
+                <w:sz w:val="16"/>
               </w:rPr>
               <w:t>[corresponding author email]</w:t>
             </w:r>
@@ -745,7 +731,7 @@
           <w:i w:val="0"/>
           <w:sz w:val="22"/>
         </w:rPr>
-        <w:t>Construction production systems are chains of specialised trades that hand work to one another across space and time. When upstream production is variable or handoffs are batched, downstream crews starve or wait, project duration grows, work-in-process (WIP) accumulates, and labour spends non-productive time on site. These mechanisms are central to Lean Construction and project production management, yet they remain difficult to experience in a lecture: spreadsheet demos are often opaque, and paper-based parade games do not scale to multi-metric comparison, cost accounting, or takt arithmetic within a single session.</w:t>
+        <w:t>Construction production systems are chains of specialised trades that hand work to one another across space and time. When upstream production is variable or handoffs are batched, downstream crews starve or wait, project duration grows, work-in-process (WIP) accumulates, and labour spends non-productive time on site. These mechanisms are central to Lean Construction and project production management, yet they remain difficult to experience in a lecture.</w:t>
       </w:r>
     </w:p>
     <w:p>
@@ -760,7 +746,21 @@
           <w:i w:val="0"/>
           <w:sz w:val="22"/>
         </w:rPr>
-        <w:t>The classic parade of trades / Parade Game pedagogy [1] established that workflow variability and trade interdependence drive system performance more than local productivity alone. Factory Physics and related production theory formalise the same ideas through Little’s Law, utilisation–variability–time (VUT) relationships, and inventory–service trade-offs [2–3,6–7]. In parallel, takt planning translates customer demand and available time into a production beat and zone structure for construction [4–5,9]. Educators need a single, transparent, open tool that (i) runs a zone-flow parade with controllable capacity, variability, and batch handoff; (ii) visualises Line of Balance (LOB), WIP, and utilisation; (iii) links outcomes to production laws; and (iv) introduces takt decisions (bays versus zones, time per floor) without requiring learners to install a programming stack.</w:t>
+        <w:t>The classic parade of trades / Parade Game pedagogy of Tommelein and colleagues [1] established that work-flow variability and sequential dependence between trades degrade system performance even when average productivities appear acceptable. That pedagogy was embodied as a physical dice game and as a computer-based Parade of Trades implementation in Visual Basic, documented by Choo and Tommelein [10], with related discrete-event studies reported alongside the game literature [1]. The original software remains a landmark teaching tool, but as a legacy desktop program it is harder to deploy in large browser-first classes, and its scope centres on the variability–dependence lesson rather than on integrated production metrics, labour idle cost, multi-scenario dashboards, or takt zoning.</w:t>
+      </w:r>
+    </w:p>
+    <w:p>
+      <w:pPr>
+        <w:spacing w:before="160" w:after="120"/>
+      </w:pPr>
+      <w:r>
+        <w:rPr>
+          <w:rFonts w:ascii="Times New Roman" w:hAnsi="Times New Roman" w:eastAsia="Times New Roman"/>
+          <w:b/>
+          <w:i w:val="0"/>
+          <w:sz w:val="22"/>
+        </w:rPr>
+        <w:t>1.1. Development lineage</w:t>
       </w:r>
     </w:p>
     <w:p>
@@ -775,7 +775,661 @@
           <w:i w:val="0"/>
           <w:sz w:val="22"/>
         </w:rPr>
-        <w:t>Parade Tim Kerja (“Work-Team Parade”) addresses that gap. It provides: (1) an open, reproducible zone-flow engine for a five-trade concrete floor cycle (formwork, rebar, pour, strip, finish), with seedable variability and configurable batch handoff including one-piece flow; (2) classroom analytics—LOB, buffer WIP, utilisation, active/idle labour cost, multi-scenario comparison (2–5 scenarios), and CSV/Excel export; (3) theory bridges—Little’s Law / WIP–throughput–cycle-time views, Kingman-style VUT intuition, and inventory–fill-rate charts; (4) a takt-plan module grounded in fixed floor geometry (360 m², 3×3 m bays → 40 bays) where bay ≠ zone, with discrete zone counts {1, 5, 10, 20, 40}, capacity in bays/day, and owner time per floor, computing train duration TD = (TW + TZ − 1) × te with TW = 5; and (5) zero-install access via Streamlit in the browser, plus an Indonesian-language teaching manual for regional adoption.</w:t>
+        <w:t>Parade Tim Kerja is explicitly developed from Tommelein’s Parade of Trades (Parade Game) foundation [1,10]. It reuses the scientific core of a sequential trade parade under variability and dependence, framed here as a five-trade concrete floor cycle in zone-flow form. The intent is continuity with the Berkeley parade pedagogy, not a disconnected rewrite: learners still confront how local variability propagates along a chain of trades.</w:t>
+      </w:r>
+    </w:p>
+    <w:p>
+      <w:pPr>
+        <w:spacing w:before="160" w:after="120"/>
+      </w:pPr>
+      <w:r>
+        <w:rPr>
+          <w:rFonts w:ascii="Times New Roman" w:hAnsi="Times New Roman" w:eastAsia="Times New Roman"/>
+          <w:b/>
+          <w:i w:val="0"/>
+          <w:sz w:val="22"/>
+        </w:rPr>
+        <w:t>1.2. Differentiation and strengths relative to the original Parade of Trades software</w:t>
+      </w:r>
+    </w:p>
+    <w:p>
+      <w:pPr>
+        <w:spacing w:after="80" w:before="0" w:line="276" w:lineRule="auto"/>
+        <w:ind w:firstLine="425"/>
+      </w:pPr>
+      <w:r>
+        <w:rPr>
+          <w:rFonts w:ascii="Times New Roman" w:hAnsi="Times New Roman" w:eastAsia="Times New Roman"/>
+          <w:b w:val="0"/>
+          <w:i w:val="0"/>
+          <w:sz w:val="22"/>
+        </w:rPr>
+        <w:t>Table 2 contrasts the original Parade of Trades game/computer software with Parade Tim Kerja and summarises the strengths of the present tool.</w:t>
+      </w:r>
+    </w:p>
+    <w:p>
+      <w:pPr>
+        <w:spacing w:after="80" w:before="0" w:line="276" w:lineRule="auto"/>
+      </w:pPr>
+      <w:r>
+        <w:rPr>
+          <w:rFonts w:ascii="Times New Roman" w:hAnsi="Times New Roman" w:eastAsia="Times New Roman"/>
+          <w:b w:val="0"/>
+          <w:i/>
+          <w:sz w:val="18"/>
+        </w:rPr>
+        <w:t>Table 2. Parade Tim Kerja versus Tommelein Parade of Trades software/game.</w:t>
+      </w:r>
+    </w:p>
+    <w:tbl>
+      <w:tblPr>
+        <w:tblStyle w:val="TableGrid"/>
+        <w:tblW w:type="auto" w:w="0"/>
+        <w:tblLook w:firstColumn="1" w:firstRow="1" w:lastColumn="0" w:lastRow="0" w:noHBand="0" w:noVBand="1" w:val="04A0"/>
+      </w:tblPr>
+      <w:tblGrid>
+        <w:gridCol w:w="3213"/>
+        <w:gridCol w:w="3213"/>
+        <w:gridCol w:w="3213"/>
+      </w:tblGrid>
+      <w:tr>
+        <w:tc>
+          <w:tcPr>
+            <w:tcW w:type="dxa" w:w="3213"/>
+          </w:tcPr>
+          <w:p>
+            <w:r/>
+            <w:r>
+              <w:rPr>
+                <w:rFonts w:ascii="Times New Roman" w:hAnsi="Times New Roman" w:eastAsia="Times New Roman"/>
+                <w:b/>
+                <w:i w:val="0"/>
+                <w:sz w:val="16"/>
+              </w:rPr>
+              <w:t>Dimension</w:t>
+            </w:r>
+          </w:p>
+        </w:tc>
+        <w:tc>
+          <w:tcPr>
+            <w:tcW w:type="dxa" w:w="3213"/>
+          </w:tcPr>
+          <w:p>
+            <w:r/>
+            <w:r>
+              <w:rPr>
+                <w:rFonts w:ascii="Times New Roman" w:hAnsi="Times New Roman" w:eastAsia="Times New Roman"/>
+                <w:b/>
+                <w:i w:val="0"/>
+                <w:sz w:val="16"/>
+              </w:rPr>
+              <w:t>Tommelein Parade of Trades (game / VB) [1,10]</w:t>
+            </w:r>
+          </w:p>
+        </w:tc>
+        <w:tc>
+          <w:tcPr>
+            <w:tcW w:type="dxa" w:w="3213"/>
+          </w:tcPr>
+          <w:p>
+            <w:r/>
+            <w:r>
+              <w:rPr>
+                <w:rFonts w:ascii="Times New Roman" w:hAnsi="Times New Roman" w:eastAsia="Times New Roman"/>
+                <w:b/>
+                <w:i w:val="0"/>
+                <w:sz w:val="16"/>
+              </w:rPr>
+              <w:t>Parade Tim Kerja (this software)</w:t>
+            </w:r>
+          </w:p>
+        </w:tc>
+      </w:tr>
+      <w:tr>
+        <w:tc>
+          <w:tcPr>
+            <w:tcW w:type="dxa" w:w="3213"/>
+          </w:tcPr>
+          <w:p>
+            <w:r/>
+            <w:r>
+              <w:rPr>
+                <w:rFonts w:ascii="Times New Roman" w:hAnsi="Times New Roman" w:eastAsia="Times New Roman"/>
+                <w:b w:val="0"/>
+                <w:i w:val="0"/>
+                <w:sz w:val="16"/>
+              </w:rPr>
+              <w:t>Core purpose</w:t>
+            </w:r>
+          </w:p>
+        </w:tc>
+        <w:tc>
+          <w:tcPr>
+            <w:tcW w:type="dxa" w:w="3213"/>
+          </w:tcPr>
+          <w:p>
+            <w:r/>
+            <w:r>
+              <w:rPr>
+                <w:rFonts w:ascii="Times New Roman" w:hAnsi="Times New Roman" w:eastAsia="Times New Roman"/>
+                <w:b w:val="0"/>
+                <w:i w:val="0"/>
+                <w:sz w:val="16"/>
+              </w:rPr>
+              <w:t>Demonstrate impact of work-flow variability &amp; dependence</w:t>
+            </w:r>
+          </w:p>
+        </w:tc>
+        <w:tc>
+          <w:tcPr>
+            <w:tcW w:type="dxa" w:w="3213"/>
+          </w:tcPr>
+          <w:p>
+            <w:r/>
+            <w:r>
+              <w:rPr>
+                <w:rFonts w:ascii="Times New Roman" w:hAnsi="Times New Roman" w:eastAsia="Times New Roman"/>
+                <w:b w:val="0"/>
+                <w:i w:val="0"/>
+                <w:sz w:val="16"/>
+              </w:rPr>
+              <w:t>Same foundation plus production metrics, cost, multi-scenario comparison, takt planning</w:t>
+            </w:r>
+          </w:p>
+        </w:tc>
+      </w:tr>
+      <w:tr>
+        <w:tc>
+          <w:tcPr>
+            <w:tcW w:type="dxa" w:w="3213"/>
+          </w:tcPr>
+          <w:p>
+            <w:r/>
+            <w:r>
+              <w:rPr>
+                <w:rFonts w:ascii="Times New Roman" w:hAnsi="Times New Roman" w:eastAsia="Times New Roman"/>
+                <w:b w:val="0"/>
+                <w:i w:val="0"/>
+                <w:sz w:val="16"/>
+              </w:rPr>
+              <w:t>Access / platform</w:t>
+            </w:r>
+          </w:p>
+        </w:tc>
+        <w:tc>
+          <w:tcPr>
+            <w:tcW w:type="dxa" w:w="3213"/>
+          </w:tcPr>
+          <w:p>
+            <w:r/>
+            <w:r>
+              <w:rPr>
+                <w:rFonts w:ascii="Times New Roman" w:hAnsi="Times New Roman" w:eastAsia="Times New Roman"/>
+                <w:b w:val="0"/>
+                <w:i w:val="0"/>
+                <w:sz w:val="16"/>
+              </w:rPr>
+              <w:t>Physical dice game; legacy Visual Basic desktop app</w:t>
+            </w:r>
+          </w:p>
+        </w:tc>
+        <w:tc>
+          <w:tcPr>
+            <w:tcW w:type="dxa" w:w="3213"/>
+          </w:tcPr>
+          <w:p>
+            <w:r/>
+            <w:r>
+              <w:rPr>
+                <w:rFonts w:ascii="Times New Roman" w:hAnsi="Times New Roman" w:eastAsia="Times New Roman"/>
+                <w:b w:val="0"/>
+                <w:i w:val="0"/>
+                <w:sz w:val="16"/>
+              </w:rPr>
+              <w:t>Open-source Python; browser (Streamlit); no learner-side install</w:t>
+            </w:r>
+          </w:p>
+        </w:tc>
+      </w:tr>
+      <w:tr>
+        <w:tc>
+          <w:tcPr>
+            <w:tcW w:type="dxa" w:w="3213"/>
+          </w:tcPr>
+          <w:p>
+            <w:r/>
+            <w:r>
+              <w:rPr>
+                <w:rFonts w:ascii="Times New Roman" w:hAnsi="Times New Roman" w:eastAsia="Times New Roman"/>
+                <w:b w:val="0"/>
+                <w:i w:val="0"/>
+                <w:sz w:val="16"/>
+              </w:rPr>
+              <w:t>Spatial model</w:t>
+            </w:r>
+          </w:p>
+        </w:tc>
+        <w:tc>
+          <w:tcPr>
+            <w:tcW w:type="dxa" w:w="3213"/>
+          </w:tcPr>
+          <w:p>
+            <w:r/>
+            <w:r>
+              <w:rPr>
+                <w:rFonts w:ascii="Times New Roman" w:hAnsi="Times New Roman" w:eastAsia="Times New Roman"/>
+                <w:b w:val="0"/>
+                <w:i w:val="0"/>
+                <w:sz w:val="16"/>
+              </w:rPr>
+              <w:t>Parade / production steps in the game tradition</w:t>
+            </w:r>
+          </w:p>
+        </w:tc>
+        <w:tc>
+          <w:tcPr>
+            <w:tcW w:type="dxa" w:w="3213"/>
+          </w:tcPr>
+          <w:p>
+            <w:r/>
+            <w:r>
+              <w:rPr>
+                <w:rFonts w:ascii="Times New Roman" w:hAnsi="Times New Roman" w:eastAsia="Times New Roman"/>
+                <w:b w:val="0"/>
+                <w:i w:val="0"/>
+                <w:sz w:val="16"/>
+              </w:rPr>
+              <w:t>Explicit zone-flow floor cycle (5 trades × zones) with batch handoff (incl. one-piece flow)</w:t>
+            </w:r>
+          </w:p>
+        </w:tc>
+      </w:tr>
+      <w:tr>
+        <w:tc>
+          <w:tcPr>
+            <w:tcW w:type="dxa" w:w="3213"/>
+          </w:tcPr>
+          <w:p>
+            <w:r/>
+            <w:r>
+              <w:rPr>
+                <w:rFonts w:ascii="Times New Roman" w:hAnsi="Times New Roman" w:eastAsia="Times New Roman"/>
+                <w:b w:val="0"/>
+                <w:i w:val="0"/>
+                <w:sz w:val="16"/>
+              </w:rPr>
+              <w:t>Variability control</w:t>
+            </w:r>
+          </w:p>
+        </w:tc>
+        <w:tc>
+          <w:tcPr>
+            <w:tcW w:type="dxa" w:w="3213"/>
+          </w:tcPr>
+          <w:p>
+            <w:r/>
+            <w:r>
+              <w:rPr>
+                <w:rFonts w:ascii="Times New Roman" w:hAnsi="Times New Roman" w:eastAsia="Times New Roman"/>
+                <w:b w:val="0"/>
+                <w:i w:val="0"/>
+                <w:sz w:val="16"/>
+              </w:rPr>
+              <w:t>Dice / scenario-based teaching design</w:t>
+            </w:r>
+          </w:p>
+        </w:tc>
+        <w:tc>
+          <w:tcPr>
+            <w:tcW w:type="dxa" w:w="3213"/>
+          </w:tcPr>
+          <w:p>
+            <w:r/>
+            <w:r>
+              <w:rPr>
+                <w:rFonts w:ascii="Times New Roman" w:hAnsi="Times New Roman" w:eastAsia="Times New Roman"/>
+                <w:b w:val="0"/>
+                <w:i w:val="0"/>
+                <w:sz w:val="16"/>
+              </w:rPr>
+              <w:t>Seedable per-zone variability levels; reproducible classroom runs</w:t>
+            </w:r>
+          </w:p>
+        </w:tc>
+      </w:tr>
+      <w:tr>
+        <w:tc>
+          <w:tcPr>
+            <w:tcW w:type="dxa" w:w="3213"/>
+          </w:tcPr>
+          <w:p>
+            <w:r/>
+            <w:r>
+              <w:rPr>
+                <w:rFonts w:ascii="Times New Roman" w:hAnsi="Times New Roman" w:eastAsia="Times New Roman"/>
+                <w:b w:val="0"/>
+                <w:i w:val="0"/>
+                <w:sz w:val="16"/>
+              </w:rPr>
+              <w:t>Visual analytics</w:t>
+            </w:r>
+          </w:p>
+        </w:tc>
+        <w:tc>
+          <w:tcPr>
+            <w:tcW w:type="dxa" w:w="3213"/>
+          </w:tcPr>
+          <w:p>
+            <w:r/>
+            <w:r>
+              <w:rPr>
+                <w:rFonts w:ascii="Times New Roman" w:hAnsi="Times New Roman" w:eastAsia="Times New Roman"/>
+                <w:b w:val="0"/>
+                <w:i w:val="0"/>
+                <w:sz w:val="16"/>
+              </w:rPr>
+              <w:t>Game outcomes / classic result plots</w:t>
+            </w:r>
+          </w:p>
+        </w:tc>
+        <w:tc>
+          <w:tcPr>
+            <w:tcW w:type="dxa" w:w="3213"/>
+          </w:tcPr>
+          <w:p>
+            <w:r/>
+            <w:r>
+              <w:rPr>
+                <w:rFonts w:ascii="Times New Roman" w:hAnsi="Times New Roman" w:eastAsia="Times New Roman"/>
+                <w:b w:val="0"/>
+                <w:i w:val="0"/>
+                <w:sz w:val="16"/>
+              </w:rPr>
+              <w:t>Line of Balance, buffer WIP, utilisation, multi-scenario overlays</w:t>
+            </w:r>
+          </w:p>
+        </w:tc>
+      </w:tr>
+      <w:tr>
+        <w:tc>
+          <w:tcPr>
+            <w:tcW w:type="dxa" w:w="3213"/>
+          </w:tcPr>
+          <w:p>
+            <w:r/>
+            <w:r>
+              <w:rPr>
+                <w:rFonts w:ascii="Times New Roman" w:hAnsi="Times New Roman" w:eastAsia="Times New Roman"/>
+                <w:b w:val="0"/>
+                <w:i w:val="0"/>
+                <w:sz w:val="16"/>
+              </w:rPr>
+              <w:t>Labour cost</w:t>
+            </w:r>
+          </w:p>
+        </w:tc>
+        <w:tc>
+          <w:tcPr>
+            <w:tcW w:type="dxa" w:w="3213"/>
+          </w:tcPr>
+          <w:p>
+            <w:r/>
+            <w:r>
+              <w:rPr>
+                <w:rFonts w:ascii="Times New Roman" w:hAnsi="Times New Roman" w:eastAsia="Times New Roman"/>
+                <w:b w:val="0"/>
+                <w:i w:val="0"/>
+                <w:sz w:val="16"/>
+              </w:rPr>
+              <w:t>Not the focus of the original teaching software</w:t>
+            </w:r>
+          </w:p>
+        </w:tc>
+        <w:tc>
+          <w:tcPr>
+            <w:tcW w:type="dxa" w:w="3213"/>
+          </w:tcPr>
+          <w:p>
+            <w:r/>
+            <w:r>
+              <w:rPr>
+                <w:rFonts w:ascii="Times New Roman" w:hAnsi="Times New Roman" w:eastAsia="Times New Roman"/>
+                <w:b w:val="0"/>
+                <w:i w:val="0"/>
+                <w:sz w:val="16"/>
+              </w:rPr>
+              <w:t>Active vs idle labour cost per trade and project totals</w:t>
+            </w:r>
+          </w:p>
+        </w:tc>
+      </w:tr>
+      <w:tr>
+        <w:tc>
+          <w:tcPr>
+            <w:tcW w:type="dxa" w:w="3213"/>
+          </w:tcPr>
+          <w:p>
+            <w:r/>
+            <w:r>
+              <w:rPr>
+                <w:rFonts w:ascii="Times New Roman" w:hAnsi="Times New Roman" w:eastAsia="Times New Roman"/>
+                <w:b w:val="0"/>
+                <w:i w:val="0"/>
+                <w:sz w:val="16"/>
+              </w:rPr>
+              <w:t>Theory bridge</w:t>
+            </w:r>
+          </w:p>
+        </w:tc>
+        <w:tc>
+          <w:tcPr>
+            <w:tcW w:type="dxa" w:w="3213"/>
+          </w:tcPr>
+          <w:p>
+            <w:r/>
+            <w:r>
+              <w:rPr>
+                <w:rFonts w:ascii="Times New Roman" w:hAnsi="Times New Roman" w:eastAsia="Times New Roman"/>
+                <w:b w:val="0"/>
+                <w:i w:val="0"/>
+                <w:sz w:val="16"/>
+              </w:rPr>
+              <w:t>Primarily variability &amp; dependence insight</w:t>
+            </w:r>
+          </w:p>
+        </w:tc>
+        <w:tc>
+          <w:tcPr>
+            <w:tcW w:type="dxa" w:w="3213"/>
+          </w:tcPr>
+          <w:p>
+            <w:r/>
+            <w:r>
+              <w:rPr>
+                <w:rFonts w:ascii="Times New Roman" w:hAnsi="Times New Roman" w:eastAsia="Times New Roman"/>
+                <w:b w:val="0"/>
+                <w:i w:val="0"/>
+                <w:sz w:val="16"/>
+              </w:rPr>
+              <w:t>Little’s Law, Kingman/VUT intuition, inventory–fill-rate charts</w:t>
+            </w:r>
+          </w:p>
+        </w:tc>
+      </w:tr>
+      <w:tr>
+        <w:tc>
+          <w:tcPr>
+            <w:tcW w:type="dxa" w:w="3213"/>
+          </w:tcPr>
+          <w:p>
+            <w:r/>
+            <w:r>
+              <w:rPr>
+                <w:rFonts w:ascii="Times New Roman" w:hAnsi="Times New Roman" w:eastAsia="Times New Roman"/>
+                <w:b w:val="0"/>
+                <w:i w:val="0"/>
+                <w:sz w:val="16"/>
+              </w:rPr>
+              <w:t>Takt / zoning</w:t>
+            </w:r>
+          </w:p>
+        </w:tc>
+        <w:tc>
+          <w:tcPr>
+            <w:tcW w:type="dxa" w:w="3213"/>
+          </w:tcPr>
+          <w:p>
+            <w:r/>
+            <w:r>
+              <w:rPr>
+                <w:rFonts w:ascii="Times New Roman" w:hAnsi="Times New Roman" w:eastAsia="Times New Roman"/>
+                <w:b w:val="0"/>
+                <w:i w:val="0"/>
+                <w:sz w:val="16"/>
+              </w:rPr>
+              <w:t>Outside the original Parade software scope</w:t>
+            </w:r>
+          </w:p>
+        </w:tc>
+        <w:tc>
+          <w:tcPr>
+            <w:tcW w:type="dxa" w:w="3213"/>
+          </w:tcPr>
+          <w:p>
+            <w:r/>
+            <w:r>
+              <w:rPr>
+                <w:rFonts w:ascii="Times New Roman" w:hAnsi="Times New Roman" w:eastAsia="Times New Roman"/>
+                <w:b w:val="0"/>
+                <w:i w:val="0"/>
+                <w:sz w:val="16"/>
+              </w:rPr>
+              <w:t>Takt module: bays ≠ zones, discrete TZ, owner time per floor, wagon chart</w:t>
+            </w:r>
+          </w:p>
+        </w:tc>
+      </w:tr>
+      <w:tr>
+        <w:tc>
+          <w:tcPr>
+            <w:tcW w:type="dxa" w:w="3213"/>
+          </w:tcPr>
+          <w:p>
+            <w:r/>
+            <w:r>
+              <w:rPr>
+                <w:rFonts w:ascii="Times New Roman" w:hAnsi="Times New Roman" w:eastAsia="Times New Roman"/>
+                <w:b w:val="0"/>
+                <w:i w:val="0"/>
+                <w:sz w:val="16"/>
+              </w:rPr>
+              <w:t>Comparison</w:t>
+            </w:r>
+          </w:p>
+        </w:tc>
+        <w:tc>
+          <w:tcPr>
+            <w:tcW w:type="dxa" w:w="3213"/>
+          </w:tcPr>
+          <w:p>
+            <w:r/>
+            <w:r>
+              <w:rPr>
+                <w:rFonts w:ascii="Times New Roman" w:hAnsi="Times New Roman" w:eastAsia="Times New Roman"/>
+                <w:b w:val="0"/>
+                <w:i w:val="0"/>
+                <w:sz w:val="16"/>
+              </w:rPr>
+              <w:t>Often one run / group experience</w:t>
+            </w:r>
+          </w:p>
+        </w:tc>
+        <w:tc>
+          <w:tcPr>
+            <w:tcW w:type="dxa" w:w="3213"/>
+          </w:tcPr>
+          <w:p>
+            <w:r/>
+            <w:r>
+              <w:rPr>
+                <w:rFonts w:ascii="Times New Roman" w:hAnsi="Times New Roman" w:eastAsia="Times New Roman"/>
+                <w:b w:val="0"/>
+                <w:i w:val="0"/>
+                <w:sz w:val="16"/>
+              </w:rPr>
+              <w:t>Built-in 2–5 scenario comparison (e.g. 5× variability; batch 1 vs 4)</w:t>
+            </w:r>
+          </w:p>
+        </w:tc>
+      </w:tr>
+      <w:tr>
+        <w:tc>
+          <w:tcPr>
+            <w:tcW w:type="dxa" w:w="3213"/>
+          </w:tcPr>
+          <w:p>
+            <w:r/>
+            <w:r>
+              <w:rPr>
+                <w:rFonts w:ascii="Times New Roman" w:hAnsi="Times New Roman" w:eastAsia="Times New Roman"/>
+                <w:b w:val="0"/>
+                <w:i w:val="0"/>
+                <w:sz w:val="16"/>
+              </w:rPr>
+              <w:t>Export &amp; teaching materials</w:t>
+            </w:r>
+          </w:p>
+        </w:tc>
+        <w:tc>
+          <w:tcPr>
+            <w:tcW w:type="dxa" w:w="3213"/>
+          </w:tcPr>
+          <w:p>
+            <w:r/>
+            <w:r>
+              <w:rPr>
+                <w:rFonts w:ascii="Times New Roman" w:hAnsi="Times New Roman" w:eastAsia="Times New Roman"/>
+                <w:b w:val="0"/>
+                <w:i w:val="0"/>
+                <w:sz w:val="16"/>
+              </w:rPr>
+              <w:t>Game instructions / technical reports</w:t>
+            </w:r>
+          </w:p>
+        </w:tc>
+        <w:tc>
+          <w:tcPr>
+            <w:tcW w:type="dxa" w:w="3213"/>
+          </w:tcPr>
+          <w:p>
+            <w:r/>
+            <w:r>
+              <w:rPr>
+                <w:rFonts w:ascii="Times New Roman" w:hAnsi="Times New Roman" w:eastAsia="Times New Roman"/>
+                <w:b w:val="0"/>
+                <w:i w:val="0"/>
+                <w:sz w:val="16"/>
+              </w:rPr>
+              <w:t>CSV/Excel export; Indonesian in-app teaching manual</w:t>
+            </w:r>
+          </w:p>
+        </w:tc>
+      </w:tr>
+    </w:tbl>
+    <w:p/>
+    <w:p>
+      <w:pPr>
+        <w:spacing w:after="120" w:before="0" w:line="276" w:lineRule="auto"/>
+        <w:ind w:firstLine="425"/>
+      </w:pPr>
+      <w:r>
+        <w:rPr>
+          <w:rFonts w:ascii="Times New Roman" w:hAnsi="Times New Roman" w:eastAsia="Times New Roman"/>
+          <w:b w:val="0"/>
+          <w:i w:val="0"/>
+          <w:sz w:val="22"/>
+        </w:rPr>
+        <w:t>In short, the strength of Parade Tim Kerja is that it preserves Tommelein’s parade insight while adding open web delivery, zone-flow and batch controls, LOB/WIP/utilisation and idle-cost accounting, explicit Factory Physics-style bridges, educational takt planning, multi-scenario comparison, and classroom export. Factory Physics [2,3] and takt planning [4,5,9] motivate those extensions; the present software packages them with the parade lesson in one browser tool.</w:t>
       </w:r>
     </w:p>
     <w:p>
@@ -790,7 +1444,7 @@
           <w:i w:val="0"/>
           <w:sz w:val="22"/>
         </w:rPr>
-        <w:t>The software is intended primarily for civil engineering and construction management education and Lean workshops; it also supports exploratory academic use wherever a transparent parade model with production metrics is required. Documented scientific and educational impact is summarised in Section 3 and should be updated with peer-reviewed outputs that used the tool [8].</w:t>
+        <w:t>Parade Tim Kerja therefore provides: (1) an open zone-flow engine in the Tommelein parade tradition [1,10] for a five-trade floor cycle, with seedable variability and batch handoff; (2) classroom analytics (LOB, WIP, utilisation, active/idle cost, 2–5 scenario comparison, CSV/Excel export); (3) theory bridges (Little’s Law, Kingman-style VUT, inventory–fill rate); (4) a takt module with fixed floor geometry (360 m², 3×3 m bays → 40 bays), discrete TZ ∈ {1,5,10,20,40}, capacity in bays/day, and TD = (TW + TZ − 1) × te with TW = 5; and (5) zero-install Streamlit access plus an Indonesian teaching manual. Documented impact is summarised in Section 3 and should cite peer-reviewed outputs that used the tool [8].</w:t>
       </w:r>
     </w:p>
     <w:p>
@@ -823,7 +1477,7 @@
     </w:p>
     <w:p>
       <w:pPr>
-        <w:spacing w:after="120" w:before="0" w:line="276" w:lineRule="auto"/>
+        <w:spacing w:after="80" w:before="0" w:line="276" w:lineRule="auto"/>
         <w:ind w:firstLine="425"/>
       </w:pPr>
       <w:r>
@@ -833,7 +1487,7 @@
           <w:i w:val="0"/>
           <w:sz w:val="22"/>
         </w:rPr>
-        <w:t>Parade Tim Kerja is implemented in Python 3 and organised into modular components (Table 2). The runtime stack comprises Streamlit (interactive UI), matplotlib (charts), NumPy, and openpyxl (Excel export). The application deploys from a public GitHub repository to Streamlit Community Cloud (or equivalent), so learners only need a web browser. Default classroom parameters in the sidebar are 10 zones (aligned with default takt TZ = 10), random seed 12345, batch handoff size 4, five fixed trades, and an editable labour rate of 100 cost units per trade-period.</w:t>
+        <w:t>Parade Tim Kerja is implemented in Python 3 with modular components (Table 3): a discrete zone-flow engine, analysis (cost, Little’s Law, Kingman-style metrics, takt plan, export), matplotlib plots, and a Streamlit UI. Dependencies are listed in requirements.txt. Default sidebar parameters (10 zones, seed 12345, batch 4, five trades) align the simulation tab with the default takt zone count for consistent classroom narratives.</w:t>
       </w:r>
     </w:p>
     <w:p>
@@ -847,7 +1501,7 @@
           <w:i/>
           <w:sz w:val="18"/>
         </w:rPr>
-        <w:t>Table 2. Main software components.</w:t>
+        <w:t>Table 3. Main software components.</w:t>
       </w:r>
     </w:p>
     <w:tbl>
@@ -863,7 +1517,7 @@
       <w:tr>
         <w:tc>
           <w:tcPr>
-            <w:tcW w:type="dxa" w:w="3118"/>
+            <w:tcW w:type="dxa" w:w="4819"/>
           </w:tcPr>
           <w:p>
             <w:r/>
@@ -872,7 +1526,7 @@
                 <w:rFonts w:ascii="Times New Roman" w:hAnsi="Times New Roman" w:eastAsia="Times New Roman"/>
                 <w:b/>
                 <w:i w:val="0"/>
-                <w:sz w:val="18"/>
+                <w:sz w:val="16"/>
               </w:rPr>
               <w:t>Component</w:t>
             </w:r>
@@ -880,7 +1534,7 @@
         </w:tc>
         <w:tc>
           <w:tcPr>
-            <w:tcW w:type="dxa" w:w="6236"/>
+            <w:tcW w:type="dxa" w:w="4819"/>
           </w:tcPr>
           <w:p>
             <w:r/>
@@ -889,7 +1543,7 @@
                 <w:rFonts w:ascii="Times New Roman" w:hAnsi="Times New Roman" w:eastAsia="Times New Roman"/>
                 <w:b/>
                 <w:i w:val="0"/>
-                <w:sz w:val="18"/>
+                <w:sz w:val="16"/>
               </w:rPr>
               <w:t>Role</w:t>
             </w:r>
@@ -899,7 +1553,7 @@
       <w:tr>
         <w:tc>
           <w:tcPr>
-            <w:tcW w:type="dxa" w:w="3118"/>
+            <w:tcW w:type="dxa" w:w="4819"/>
           </w:tcPr>
           <w:p>
             <w:r/>
@@ -908,7 +1562,7 @@
                 <w:rFonts w:ascii="Times New Roman" w:hAnsi="Times New Roman" w:eastAsia="Times New Roman"/>
                 <w:b w:val="0"/>
                 <w:i w:val="0"/>
-                <w:sz w:val="18"/>
+                <w:sz w:val="16"/>
               </w:rPr>
               <w:t>parade_of_trades_core.py</w:t>
             </w:r>
@@ -916,7 +1570,7 @@
         </w:tc>
         <w:tc>
           <w:tcPr>
-            <w:tcW w:type="dxa" w:w="6236"/>
+            <w:tcW w:type="dxa" w:w="4819"/>
           </w:tcPr>
           <w:p>
             <w:r/>
@@ -925,9 +1579,9 @@
                 <w:rFonts w:ascii="Times New Roman" w:hAnsi="Times New Roman" w:eastAsia="Times New Roman"/>
                 <w:b w:val="0"/>
                 <w:i w:val="0"/>
-                <w:sz w:val="18"/>
+                <w:sz w:val="16"/>
               </w:rPr>
-              <w:t>Discrete zone-flow engine: capacities, per-zone variability, batch handoff, production history, duration.</w:t>
+              <w:t>Zone-flow engine: capacity, variability, batch handoff, history, duration.</w:t>
             </w:r>
           </w:p>
         </w:tc>
@@ -935,7 +1589,7 @@
       <w:tr>
         <w:tc>
           <w:tcPr>
-            <w:tcW w:type="dxa" w:w="3118"/>
+            <w:tcW w:type="dxa" w:w="4819"/>
           </w:tcPr>
           <w:p>
             <w:r/>
@@ -944,7 +1598,7 @@
                 <w:rFonts w:ascii="Times New Roman" w:hAnsi="Times New Roman" w:eastAsia="Times New Roman"/>
                 <w:b w:val="0"/>
                 <w:i w:val="0"/>
-                <w:sz w:val="18"/>
+                <w:sz w:val="16"/>
               </w:rPr>
               <w:t>parade_of_trades_analysis.py</w:t>
             </w:r>
@@ -952,7 +1606,7 @@
         </w:tc>
         <w:tc>
           <w:tcPr>
-            <w:tcW w:type="dxa" w:w="6236"/>
+            <w:tcW w:type="dxa" w:w="4819"/>
           </w:tcPr>
           <w:p>
             <w:r/>
@@ -961,9 +1615,9 @@
                 <w:rFonts w:ascii="Times New Roman" w:hAnsi="Times New Roman" w:eastAsia="Times New Roman"/>
                 <w:b w:val="0"/>
                 <w:i w:val="0"/>
-                <w:sz w:val="18"/>
+                <w:sz w:val="16"/>
               </w:rPr>
-              <w:t>Active/idle cost, Little’s Law, Kingman-style metrics, inventory–fill rate, takt plan TD=(TW+TZ−1)×te, export.</w:t>
+              <w:t>Cost, Little’s Law, Kingman-style metrics, takt TD, export helpers.</w:t>
             </w:r>
           </w:p>
         </w:tc>
@@ -971,7 +1625,7 @@
       <w:tr>
         <w:tc>
           <w:tcPr>
-            <w:tcW w:type="dxa" w:w="3118"/>
+            <w:tcW w:type="dxa" w:w="4819"/>
           </w:tcPr>
           <w:p>
             <w:r/>
@@ -980,7 +1634,7 @@
                 <w:rFonts w:ascii="Times New Roman" w:hAnsi="Times New Roman" w:eastAsia="Times New Roman"/>
                 <w:b w:val="0"/>
                 <w:i w:val="0"/>
-                <w:sz w:val="18"/>
+                <w:sz w:val="16"/>
               </w:rPr>
               <w:t>parade_of_trades_plots.py</w:t>
             </w:r>
@@ -988,7 +1642,7 @@
         </w:tc>
         <w:tc>
           <w:tcPr>
-            <w:tcW w:type="dxa" w:w="6236"/>
+            <w:tcW w:type="dxa" w:w="4819"/>
           </w:tcPr>
           <w:p>
             <w:r/>
@@ -997,9 +1651,9 @@
                 <w:rFonts w:ascii="Times New Roman" w:hAnsi="Times New Roman" w:eastAsia="Times New Roman"/>
                 <w:b w:val="0"/>
                 <w:i w:val="0"/>
-                <w:sz w:val="18"/>
+                <w:sz w:val="16"/>
               </w:rPr>
-              <w:t>LOB, WIP, utilisation, cost comparison, takt wagon chart, theory plots (matplotlib).</w:t>
+              <w:t>LOB, WIP, utilisation, cost, takt wagon, theory plots.</w:t>
             </w:r>
           </w:p>
         </w:tc>
@@ -1007,7 +1661,7 @@
       <w:tr>
         <w:tc>
           <w:tcPr>
-            <w:tcW w:type="dxa" w:w="3118"/>
+            <w:tcW w:type="dxa" w:w="4819"/>
           </w:tcPr>
           <w:p>
             <w:r/>
@@ -1016,7 +1670,7 @@
                 <w:rFonts w:ascii="Times New Roman" w:hAnsi="Times New Roman" w:eastAsia="Times New Roman"/>
                 <w:b w:val="0"/>
                 <w:i w:val="0"/>
-                <w:sz w:val="18"/>
+                <w:sz w:val="16"/>
               </w:rPr>
               <w:t>app.py</w:t>
             </w:r>
@@ -1024,7 +1678,7 @@
         </w:tc>
         <w:tc>
           <w:tcPr>
-            <w:tcW w:type="dxa" w:w="6236"/>
+            <w:tcW w:type="dxa" w:w="4819"/>
           </w:tcPr>
           <w:p>
             <w:r/>
@@ -1033,9 +1687,9 @@
                 <w:rFonts w:ascii="Times New Roman" w:hAnsi="Times New Roman" w:eastAsia="Times New Roman"/>
                 <w:b w:val="0"/>
                 <w:i w:val="0"/>
-                <w:sz w:val="18"/>
+                <w:sz w:val="16"/>
               </w:rPr>
-              <w:t>Streamlit UI: sidebar, Simulation / Comparison / Takt plan / Manual tabs, downloads.</w:t>
+              <w:t>Streamlit UI: Simulation, Comparison, Takt plan, Manual.</w:t>
             </w:r>
           </w:p>
         </w:tc>
@@ -1043,7 +1697,7 @@
       <w:tr>
         <w:tc>
           <w:tcPr>
-            <w:tcW w:type="dxa" w:w="3118"/>
+            <w:tcW w:type="dxa" w:w="4819"/>
           </w:tcPr>
           <w:p>
             <w:r/>
@@ -1052,7 +1706,7 @@
                 <w:rFonts w:ascii="Times New Roman" w:hAnsi="Times New Roman" w:eastAsia="Times New Roman"/>
                 <w:b w:val="0"/>
                 <w:i w:val="0"/>
-                <w:sz w:val="18"/>
+                <w:sz w:val="16"/>
               </w:rPr>
               <w:t>MANUAL.md</w:t>
             </w:r>
@@ -1060,7 +1714,7 @@
         </w:tc>
         <w:tc>
           <w:tcPr>
-            <w:tcW w:type="dxa" w:w="6236"/>
+            <w:tcW w:type="dxa" w:w="4819"/>
           </w:tcPr>
           <w:p>
             <w:r/>
@@ -1069,9 +1723,9 @@
                 <w:rFonts w:ascii="Times New Roman" w:hAnsi="Times New Roman" w:eastAsia="Times New Roman"/>
                 <w:b w:val="0"/>
                 <w:i w:val="0"/>
-                <w:sz w:val="18"/>
+                <w:sz w:val="16"/>
               </w:rPr>
-              <w:t>Indonesian teaching manual aligned with the current model.</w:t>
+              <w:t>Indonesian teaching manual.</w:t>
             </w:r>
           </w:p>
         </w:tc>
@@ -1079,7 +1733,7 @@
       <w:tr>
         <w:tc>
           <w:tcPr>
-            <w:tcW w:type="dxa" w:w="3118"/>
+            <w:tcW w:type="dxa" w:w="4819"/>
           </w:tcPr>
           <w:p>
             <w:r/>
@@ -1088,7 +1742,7 @@
                 <w:rFonts w:ascii="Times New Roman" w:hAnsi="Times New Roman" w:eastAsia="Times New Roman"/>
                 <w:b w:val="0"/>
                 <w:i w:val="0"/>
-                <w:sz w:val="18"/>
+                <w:sz w:val="16"/>
               </w:rPr>
               <w:t>test_*.py</w:t>
             </w:r>
@@ -1096,7 +1750,7 @@
         </w:tc>
         <w:tc>
           <w:tcPr>
-            <w:tcW w:type="dxa" w:w="6236"/>
+            <w:tcW w:type="dxa" w:w="4819"/>
           </w:tcPr>
           <w:p>
             <w:r/>
@@ -1105,9 +1759,9 @@
                 <w:rFonts w:ascii="Times New Roman" w:hAnsi="Times New Roman" w:eastAsia="Times New Roman"/>
                 <w:b w:val="0"/>
                 <w:i w:val="0"/>
-                <w:sz w:val="18"/>
+                <w:sz w:val="16"/>
               </w:rPr>
-              <w:t>Unit and regression tests for the core engine and plots.</w:t>
+              <w:t>Regression tests for engine and plots.</w:t>
             </w:r>
           </w:p>
         </w:tc>
@@ -1140,67 +1794,7 @@
           <w:i w:val="0"/>
           <w:sz w:val="22"/>
         </w:rPr>
-        <w:t>Simulation (single scenario). Users select uniform or per-trade capacity profiles, variability level (none to very high), and batch handoff size. A run produces project duration, system throughput, summed active and idle team-periods (explicitly distinguished from calendar duration), active/idle cost, LOB, buffer WIP, utilisation, and deep-dive analytics for Little’s Law, Kingman-style intuition, and inventory–fill rate. Per-trade tables report start, finish, time on site, active/idle periods, and cost.</w:t>
-      </w:r>
-    </w:p>
-    <w:p>
-      <w:pPr>
-        <w:spacing w:after="120" w:before="0" w:line="276" w:lineRule="auto"/>
-        <w:ind w:firstLine="425"/>
-      </w:pPr>
-      <w:r>
-        <w:rPr>
-          <w:rFonts w:ascii="Times New Roman" w:hAnsi="Times New Roman" w:eastAsia="Times New Roman"/>
-          <w:b w:val="0"/>
-          <w:i w:val="0"/>
-          <w:sz w:val="22"/>
-        </w:rPr>
-        <w:t>Comparison (2–5 scenarios). Quick fills include five variability levels, no-variability versus medium variability, and batch size 1 versus 4. Results are compared on duration, stacked active/idle cost, WIP, utilisation, and theory metrics, supporting head-to-head classroom discussion.</w:t>
-      </w:r>
-    </w:p>
-    <w:p>
-      <w:pPr>
-        <w:spacing w:after="120" w:before="0" w:line="276" w:lineRule="auto"/>
-        <w:ind w:firstLine="425"/>
-      </w:pPr>
-      <w:r>
-        <w:rPr>
-          <w:rFonts w:ascii="Times New Roman" w:hAnsi="Times New Roman" w:eastAsia="Times New Roman"/>
-          <w:b w:val="0"/>
-          <w:i w:val="0"/>
-          <w:sz w:val="22"/>
-        </w:rPr>
-        <w:t>Takt plan (educational). Each floor is fixed at 360 m² with 3×3 m bays (9 m²), hence 40 bays per floor. Users set the number of floors (default 1), discrete zone count TZ ∈ {1, 5, 10, 20, 40} so that bays per zone are integers, available time per floor (default 15 days), and capacity in bays per day per team (default 4). Mapping: bays/zone = 40/TZ; zones/day = (bays/day)/(bays/zone); te = 1/(zones/day). Train duration per floor follows TD = (TW + TZ − 1) × te with TW = 5 wagons fixed. Wagon charts label trades T1–T5 on bars. Feasibility is checked against time per floor only.</w:t>
-      </w:r>
-    </w:p>
-    <w:p>
-      <w:pPr>
-        <w:spacing w:after="120" w:before="0" w:line="276" w:lineRule="auto"/>
-        <w:ind w:firstLine="425"/>
-      </w:pPr>
-      <w:r>
-        <w:rPr>
-          <w:rFonts w:ascii="Times New Roman" w:hAnsi="Times New Roman" w:eastAsia="Times New Roman"/>
-          <w:b w:val="0"/>
-          <w:i w:val="0"/>
-          <w:sz w:val="22"/>
-        </w:rPr>
-        <w:t>Export and documentation. CSV/Excel downloads support assessment and presentations. An in-app Manual tab documents model definitions, including the cost window (start to own finish) and the distinction between bays and zones.</w:t>
-      </w:r>
-    </w:p>
-    <w:p>
-      <w:pPr>
-        <w:spacing w:after="120" w:before="0" w:line="276" w:lineRule="auto"/>
-        <w:ind w:firstLine="425"/>
-      </w:pPr>
-      <w:r>
-        <w:rPr>
-          <w:rFonts w:ascii="Times New Roman" w:hAnsi="Times New Roman" w:eastAsia="Times New Roman"/>
-          <w:b w:val="0"/>
-          <w:i w:val="0"/>
-          <w:sz w:val="22"/>
-        </w:rPr>
-        <w:t>Fig. 1 illustrates a representative Line of Balance under variability. Fig. 2 shows a takt wagon chart for TZ = 10 with normal capacity of 4 bays/day (te = 1 day/zone), yielding TD = 14 days per floor.</w:t>
+        <w:t>Simulation runs a single zone-flow scenario (capacity, variability, batch) and reports duration, throughput, active/idle team-periods and costs, LOB, WIP, utilisation, and theory tabs. Comparison supports 2–5 scenarios with quick fills (e.g. five variability levels; batch 1 vs 4). The takt module fixes 360 m² floors and 40 bays (3×3 m), lets users choose TZ from {1,5,10,20,40}, time per floor, and bays/day capacity, then computes te and TD and draws a wagon chart. CSV/Excel export and the Manual tab support assessment. Fig. 1 and Fig. 2 (placeholders) should show LOB and takt wagon screenshots.</w:t>
       </w:r>
     </w:p>
     <w:p>
@@ -1215,12 +1809,12 @@
           <w:i/>
           <w:sz w:val="20"/>
         </w:rPr>
-        <w:t>[Insert Figure 1 here — Line of Balance screenshot from the Simulation tab]</w:t>
+        <w:t>[Insert Figure 1 — LOB screenshot]</w:t>
       </w:r>
     </w:p>
     <w:p>
       <w:pPr>
-        <w:spacing w:after="160" w:before="0" w:line="276" w:lineRule="auto"/>
+        <w:spacing w:after="120" w:before="0" w:line="276" w:lineRule="auto"/>
       </w:pPr>
       <w:r>
         <w:rPr>
@@ -1229,7 +1823,7 @@
           <w:i/>
           <w:sz w:val="18"/>
         </w:rPr>
-        <w:t>Fig. 1. Line of Balance for a five-trade zone-flow run (illustrative). Horizontal spacing between curves reflects waiting/buffer between trades.</w:t>
+        <w:t>Fig. 1. Line of Balance for a five-trade zone-flow run (illustrative).</w:t>
       </w:r>
     </w:p>
     <w:p>
@@ -1244,7 +1838,7 @@
           <w:i/>
           <w:sz w:val="20"/>
         </w:rPr>
-        <w:t>[Insert Figure 2 here — Takt wagon chart screenshot]</w:t>
+        <w:t>[Insert Figure 2 — Takt wagon screenshot]</w:t>
       </w:r>
     </w:p>
     <w:p>
@@ -1258,7 +1852,7 @@
           <w:i/>
           <w:sz w:val="18"/>
         </w:rPr>
-        <w:t>Fig. 2. Takt wagon chart for one floor (TW = 5, TZ = 10). Bar labels identify trades T1–T5.</w:t>
+        <w:t>Fig. 2. Takt wagon chart (TW = 5, TZ = 10) with on-bar trade labels T1–T5.</w:t>
       </w:r>
     </w:p>
     <w:p>
@@ -1287,21 +1881,7 @@
           <w:i w:val="0"/>
           <w:sz w:val="22"/>
         </w:rPr>
-        <w:t>Software Impacts requires evidence that the software addresses a research or educational challenge and has contributed to scholarly outputs. The following statements must be completed with verifiable institutional and bibliographic data before submission.</w:t>
-      </w:r>
-    </w:p>
-    <w:p>
-      <w:pPr>
-        <w:spacing w:before="160" w:after="120"/>
-      </w:pPr>
-      <w:r>
-        <w:rPr>
-          <w:rFonts w:ascii="Times New Roman" w:hAnsi="Times New Roman" w:eastAsia="Times New Roman"/>
-          <w:b/>
-          <w:i w:val="0"/>
-          <w:sz w:val="22"/>
-        </w:rPr>
-        <w:t>3.1. Research and educational challenge addressed</w:t>
+        <w:t>Building on Tommelein’s Parade of Trades [1,10], the software operationalises parade dynamics for repeatable classroom experiments on variability, batch handoff, idle cost, and takt zone granularity.</w:t>
       </w:r>
     </w:p>
     <w:p>
@@ -1316,95 +1896,7 @@
           <w:i w:val="0"/>
           <w:sz w:val="22"/>
         </w:rPr>
-        <w:t>The software operationalises parade-of-trades dynamics and production laws in a form suitable for repeatable classroom experiments and exploratory analysis of variability, batch handoff, labour idle cost, and takt zone granularity—topics that are otherwise taught only qualitatively or with one-off spreadsheets.</w:t>
-      </w:r>
-    </w:p>
-    <w:p>
-      <w:pPr>
-        <w:spacing w:before="160" w:after="120"/>
-      </w:pPr>
-      <w:r>
-        <w:rPr>
-          <w:rFonts w:ascii="Times New Roman" w:hAnsi="Times New Roman" w:eastAsia="Times New Roman"/>
-          <w:b/>
-          <w:i w:val="0"/>
-          <w:sz w:val="22"/>
-        </w:rPr>
-        <w:t>3.2. Evidence of use and scientific contribution</w:t>
-      </w:r>
-    </w:p>
-    <w:p>
-      <w:pPr>
-        <w:spacing w:after="120" w:before="0" w:line="276" w:lineRule="auto"/>
-        <w:ind w:firstLine="425"/>
-      </w:pPr>
-      <w:r>
-        <w:rPr>
-          <w:rFonts w:ascii="Times New Roman" w:hAnsi="Times New Roman" w:eastAsia="Times New Roman"/>
-          <w:b w:val="0"/>
-          <w:i w:val="0"/>
-          <w:sz w:val="22"/>
-        </w:rPr>
-        <w:t>Teaching deployment. Parade Tim Kerja has been used in [COURSE CODE — Course name] at [University], [Country], with approximately [N] students in [semester/year]. Students ran controlled scenarios (e.g. variability sweep; batch 1 versus 4) and interpreted LOB, WIP, cost, and takt TD against owner time per floor.</w:t>
-      </w:r>
-    </w:p>
-    <w:p>
-      <w:pPr>
-        <w:spacing w:after="120" w:before="0" w:line="276" w:lineRule="auto"/>
-        <w:ind w:firstLine="425"/>
-      </w:pPr>
-      <w:r>
-        <w:rPr>
-          <w:rFonts w:ascii="Times New Roman" w:hAnsi="Times New Roman" w:eastAsia="Times New Roman"/>
-          <w:b w:val="0"/>
-          <w:i w:val="0"/>
-          <w:sz w:val="22"/>
-        </w:rPr>
-        <w:t>Workshops. The tool supported Lean Construction / project production workshops at [event or institution], [year], reaching [N] practitioners/students.</w:t>
-      </w:r>
-    </w:p>
-    <w:p>
-      <w:pPr>
-        <w:spacing w:after="120" w:before="0" w:line="276" w:lineRule="auto"/>
-        <w:ind w:firstLine="425"/>
-      </w:pPr>
-      <w:r>
-        <w:rPr>
-          <w:rFonts w:ascii="Times New Roman" w:hAnsi="Times New Roman" w:eastAsia="Times New Roman"/>
-          <w:b w:val="0"/>
-          <w:i w:val="0"/>
-          <w:sz w:val="22"/>
-        </w:rPr>
-        <w:t>Scholarly outputs. Results obtained with (or enabled by) the software appear in: [Author et al., Year. Full bibliographic reference of peer-reviewed article with DOI] [8]. Optional additional outputs: [thesis, conference paper, preprint].</w:t>
-      </w:r>
-    </w:p>
-    <w:p>
-      <w:pPr>
-        <w:spacing w:after="120" w:before="0" w:line="276" w:lineRule="auto"/>
-        <w:ind w:firstLine="425"/>
-      </w:pPr>
-      <w:r>
-        <w:rPr>
-          <w:rFonts w:ascii="Times New Roman" w:hAnsi="Times New Roman" w:eastAsia="Times New Roman"/>
-          <w:b w:val="0"/>
-          <w:i w:val="0"/>
-          <w:sz w:val="22"/>
-        </w:rPr>
-        <w:t>Open reuse. Source code and the teaching manual are public. Instructors can fork parameters (zones, seed, rates) for local curricula once an OSI-approved licence file is present on the default branch.</w:t>
-      </w:r>
-    </w:p>
-    <w:p>
-      <w:pPr>
-        <w:spacing w:before="160" w:after="120"/>
-      </w:pPr>
-      <w:r>
-        <w:rPr>
-          <w:rFonts w:ascii="Times New Roman" w:hAnsi="Times New Roman" w:eastAsia="Times New Roman"/>
-          <w:b/>
-          <w:i w:val="0"/>
-          <w:sz w:val="22"/>
-        </w:rPr>
-        <w:t>3.3. Expected ongoing impact</w:t>
+        <w:t>Teaching deployment. Used in [COURSE] at [University], [Country], with approximately [N] students in [semester/year]. Workshops: [event], [year], [N] participants. Scholarly outputs that used the software: [8]. Open reuse via GitHub under an OSI licence [PLACEHOLDER].</w:t>
       </w:r>
     </w:p>
     <w:p>
@@ -1419,7 +1911,7 @@
           <w:i w:val="0"/>
           <w:sz w:val="22"/>
         </w:rPr>
-        <w:t>We expect continued use in construction-management courses, replication of variability lessons with richer metrics (cost, Little’s Law, Kingman), and extensions to multi-floor or project-specific capacity data. Citation of the software and this Software Impacts article will provide a stable reference for reuse.</w:t>
+        <w:t>Expected impact includes continued course use, richer Tommelein-style variability lessons with cost and Factory Physics metrics, and extensions (multi-floor, field data). Cite this Software Impacts article for stable reuse.</w:t>
       </w:r>
     </w:p>
     <w:p>
@@ -1438,36 +1930,6 @@
     </w:p>
     <w:p>
       <w:pPr>
-        <w:spacing w:after="120" w:before="0" w:line="276" w:lineRule="auto"/>
-        <w:ind w:firstLine="425"/>
-      </w:pPr>
-      <w:r>
-        <w:rPr>
-          <w:rFonts w:ascii="Times New Roman" w:hAnsi="Times New Roman" w:eastAsia="Times New Roman"/>
-          <w:b w:val="0"/>
-          <w:i w:val="0"/>
-          <w:sz w:val="22"/>
-        </w:rPr>
-        <w:t>Example A — Variability and idle cost. With 10 zones, normal capacity, batch size 4, and no variability, calendar duration and team-period totals diverge conceptually: five trades overlap, so summed active team-periods can exceed project duration, while idle team-periods stay near zero. Raising variability increases starvation between trades, idle periods, idle cost, and duration—visible as LOB discontinuities and in stacked cost charts.</w:t>
-      </w:r>
-    </w:p>
-    <w:p>
-      <w:pPr>
-        <w:spacing w:after="120" w:before="0" w:line="276" w:lineRule="auto"/>
-        <w:ind w:firstLine="425"/>
-      </w:pPr>
-      <w:r>
-        <w:rPr>
-          <w:rFonts w:ascii="Times New Roman" w:hAnsi="Times New Roman" w:eastAsia="Times New Roman"/>
-          <w:b w:val="0"/>
-          <w:i w:val="0"/>
-          <w:sz w:val="22"/>
-        </w:rPr>
-        <w:t>Example B — Batch handoff. Comparing batch 1 (one-piece flow) with batch 4 under no variability typically shortens calendar duration for smaller batches, while pure active work content may remain similar if crews never wait—reinforcing that project duration is not identical to active labour cost when idle is zero.</w:t>
-      </w:r>
-    </w:p>
-    <w:p>
-      <w:pPr>
         <w:spacing w:after="160" w:before="0" w:line="276" w:lineRule="auto"/>
         <w:ind w:firstLine="425"/>
       </w:pPr>
@@ -1478,7 +1940,7 @@
           <w:i w:val="0"/>
           <w:sz w:val="22"/>
         </w:rPr>
-        <w:t>Example C — Takt zone granularity. For a 360 m² floor (40 bays), capacity 4 bays/day/team, and TW = 5: TZ = 10 yields 4 bays/zone and 1 zone/day (te = 1), hence TD = (5 + 10 − 1) × 1 = 14 days/floor; TZ = 20 yields 2 bays/zone and 2 zones/day (te = 0.5), hence TD = (5 + 20 − 1) × 0.5 = 12 days/floor. Relative to a 15-day owner allowance per floor, both nominal plans are feasible, whereas coarser zoning (e.g. TZ = 5) lengthens TD and may violate the allowance—supporting discussion of zone size as a planning decision rather than as customer demand.</w:t>
+        <w:t>Example A — Variability raises idle team-periods and cost versus a no-variability baseline at equal mean capacity. Example B — Batch 1 vs 4 changes calendar duration even when active work content is similar if idle is zero. Example C — Takt: TZ = 10 and 4 bays/day → te = 1 day/zone → TD = (5+10−1)×1 = 14 days/floor; TZ = 20 → TD = 12 days/floor, illustrating finer zoning under fixed bay inventory and capacity.</w:t>
       </w:r>
     </w:p>
     <w:p>
@@ -1507,7 +1969,7 @@
           <w:i w:val="0"/>
           <w:sz w:val="22"/>
         </w:rPr>
-        <w:t>Parade Tim Kerja packages a transparent zone-flow parade engine, production-system analytics, labour active/idle costing, multi-scenario comparison, and a bay/zone-aware takt module in an open browser application aimed at construction education and workshop use. Future work may include multi-floor parallel scheduling, bilingual UI, import of field productivity samples, accessibility improvements, and packaged CodeOcean capsules for formal reproducibility badges.</w:t>
+        <w:t>Parade Tim Kerja continues Tommelein’s Parade of Trades pedagogy in an open browser environment and strengthens it with zone-flow controls, production analytics, idle-cost accounting, multi-scenario comparison, and takt planning (bays ≠ zones). Future work may add multi-floor parallelism, bilingual UI, field productivity import, and CodeOcean capsules.</w:t>
       </w:r>
     </w:p>
     <w:p>
@@ -1526,7 +1988,7 @@
     </w:p>
     <w:p>
       <w:pPr>
-        <w:spacing w:after="160" w:before="0" w:line="276" w:lineRule="auto"/>
+        <w:spacing w:after="120" w:before="0" w:line="276" w:lineRule="auto"/>
       </w:pPr>
       <w:r>
         <w:rPr>
@@ -1535,7 +1997,7 @@
           <w:i w:val="0"/>
           <w:sz w:val="20"/>
         </w:rPr>
-        <w:t>[Author A]: Conceptualization, Methodology, Software, Writing – original draft. [Author B]: Software, Validation, Writing – review &amp; editing. [Complete using the Elsevier CRediT taxonomy.]</w:t>
+        <w:t>[Author A]: Conceptualization, Methodology, Software, Writing – original draft. [Author B]: …</w:t>
       </w:r>
     </w:p>
     <w:p>
@@ -1554,7 +2016,7 @@
     </w:p>
     <w:p>
       <w:pPr>
-        <w:spacing w:after="160" w:before="0" w:line="276" w:lineRule="auto"/>
+        <w:spacing w:after="120" w:before="0" w:line="276" w:lineRule="auto"/>
       </w:pPr>
       <w:r>
         <w:rPr>
@@ -1582,16 +2044,16 @@
     </w:p>
     <w:p>
       <w:pPr>
-        <w:spacing w:after="160" w:before="0" w:line="276" w:lineRule="auto"/>
+        <w:spacing w:after="120" w:before="0" w:line="276" w:lineRule="auto"/>
       </w:pPr>
       <w:r>
         <w:rPr>
           <w:rFonts w:ascii="Times New Roman" w:hAnsi="Times New Roman" w:eastAsia="Times New Roman"/>
           <w:b w:val="0"/>
-          <w:i/>
+          <w:i w:val="0"/>
           <w:sz w:val="20"/>
         </w:rPr>
-        <w:t>[Optional: colleagues, classroom testers, or institutions that supported pilots.]</w:t>
+        <w:t>The authors acknowledge the foundational Parade of Trades pedagogy and software tradition of Iris D. Tommelein and colleagues [1,10], on which this educational implementation builds. [Optional further thanks.]</w:t>
       </w:r>
     </w:p>
     <w:p>
@@ -1610,7 +2072,7 @@
     </w:p>
     <w:p>
       <w:pPr>
-        <w:spacing w:after="160" w:before="0" w:line="276" w:lineRule="auto"/>
+        <w:spacing w:after="120" w:before="0" w:line="276" w:lineRule="auto"/>
       </w:pPr>
       <w:r>
         <w:rPr>
@@ -1619,7 +2081,7 @@
           <w:i w:val="0"/>
           <w:sz w:val="20"/>
         </w:rPr>
-        <w:t>This research did not receive any specific grant from funding agencies in the public, commercial, or not-for-profit sectors. [Or state grant details.]</w:t>
+        <w:t>This research did not receive any specific grant from funding agencies in the public, commercial, or not-for-profit sectors.</w:t>
       </w:r>
     </w:p>
     <w:p>
@@ -1638,7 +2100,7 @@
     </w:p>
     <w:p>
       <w:pPr>
-        <w:spacing w:after="160" w:before="0" w:line="276" w:lineRule="auto"/>
+        <w:spacing w:after="120" w:before="0" w:line="276" w:lineRule="auto"/>
       </w:pPr>
       <w:r>
         <w:rPr>
@@ -1647,7 +2109,7 @@
           <w:i w:val="0"/>
           <w:sz w:val="20"/>
         </w:rPr>
-        <w:t>[If applicable:] During the preparation of this work the author(s) used [TOOL] in order to [improve language / draft structure]. After using this tool/service, the author(s) reviewed and edited the content as needed and take(s) full responsibility for the content of the publication. [If none, delete this section or state that no generative AI was used for manuscript text.]</w:t>
+        <w:t>[If applicable, disclose tool and purpose; otherwise delete or state none used for manuscript text.]</w:t>
       </w:r>
     </w:p>
     <w:p>
@@ -1666,7 +2128,7 @@
     </w:p>
     <w:p>
       <w:pPr>
-        <w:spacing w:after="160" w:before="0" w:line="276" w:lineRule="auto"/>
+        <w:spacing w:after="120" w:before="0" w:line="276" w:lineRule="auto"/>
       </w:pPr>
       <w:r>
         <w:rPr>
@@ -1675,7 +2137,7 @@
           <w:i w:val="0"/>
           <w:sz w:val="20"/>
         </w:rPr>
-        <w:t>Simulation outputs are generated at runtime from user parameters and optional random seeds; they are not deposited as a static dataset. Example exports can be reproduced from the public repository using the documented defaults (total zones = 10, seed = 12345). The teaching manual is included in the repository (MANUAL.md).</w:t>
+        <w:t>Outputs are generated at runtime from user parameters and seeds; defaults (10 zones, seed 12345) reproduce classroom examples. MANUAL.md is in the repository.</w:t>
       </w:r>
     </w:p>
     <w:p>
@@ -1694,7 +2156,7 @@
     </w:p>
     <w:p>
       <w:pPr>
-        <w:spacing w:after="200" w:before="0" w:line="276" w:lineRule="auto"/>
+        <w:spacing w:after="160" w:before="0" w:line="276" w:lineRule="auto"/>
       </w:pPr>
       <w:r>
         <w:rPr>
@@ -1703,7 +2165,7 @@
           <w:i w:val="0"/>
           <w:sz w:val="20"/>
         </w:rPr>
-        <w:t>Program title: Parade Tim Kerja. Developers: [Names]. Contact address: [email]. Year first available: 2026. Hardware requirements: standard web browser, or PC with Python 3. Software requirements: see requirements.txt. Program language: Python. Source code: https://github.com/m46d45/Parade-Tim-Kerja . Live demonstration: [https://____.streamlit.app].</w:t>
+        <w:t>Program title: Parade Tim Kerja. Source: https://github.com/m46d45/Parade-Tim-Kerja . Live demo: [Streamlit URL]. Year first available: 2026. Language: Python. Licence: [OSI-approved].</w:t>
       </w:r>
     </w:p>
     <w:p>
@@ -1722,7 +2184,7 @@
     </w:p>
     <w:p>
       <w:pPr>
-        <w:spacing w:after="80"/>
+        <w:spacing w:after="60"/>
         <w:ind w:left="425" w:hanging="425"/>
       </w:pPr>
       <w:r>
@@ -1737,7 +2199,7 @@
     </w:p>
     <w:p>
       <w:pPr>
-        <w:spacing w:after="80"/>
+        <w:spacing w:after="60"/>
         <w:ind w:left="425" w:hanging="425"/>
       </w:pPr>
       <w:r>
@@ -1752,7 +2214,7 @@
     </w:p>
     <w:p>
       <w:pPr>
-        <w:spacing w:after="80"/>
+        <w:spacing w:after="60"/>
         <w:ind w:left="425" w:hanging="425"/>
       </w:pPr>
       <w:r>
@@ -1762,12 +2224,12 @@
           <w:i w:val="0"/>
           <w:sz w:val="18"/>
         </w:rPr>
-        <w:t>[3] J.D.C. Little, S.C. Graves, Little’s Law, in: D. Chhajed, T.J. Lowe (Eds.), Building Intuition, Springer, 2008, pp. 81–100. https://doi.org/10.1007/978-0-387-73699-0_5</w:t>
+        <w:t>[3] J.D.C. Little, S.C. Graves, Little’s Law, in: D. Chhajed, T.J. Lowe (Eds.), Building Intuition, Springer, 2008, pp. 81–100.</w:t>
       </w:r>
     </w:p>
     <w:p>
       <w:pPr>
-        <w:spacing w:after="80"/>
+        <w:spacing w:after="60"/>
         <w:ind w:left="425" w:hanging="425"/>
       </w:pPr>
       <w:r>
@@ -1782,7 +2244,7 @@
     </w:p>
     <w:p>
       <w:pPr>
-        <w:spacing w:after="80"/>
+        <w:spacing w:after="60"/>
         <w:ind w:left="425" w:hanging="425"/>
       </w:pPr>
       <w:r>
@@ -1792,12 +2254,12 @@
           <w:i w:val="0"/>
           <w:sz w:val="18"/>
         </w:rPr>
-        <w:t>[5] A. Frandson, K. Berghede, I.D. Tommelein, Takt time planning for construction of exterior cladding, in: Proc. 21st Annual Conference of the International Group for Lean Construction (IGLC), Fortaleza, Brazil, 2013.</w:t>
+        <w:t>[5] A. Frandson, K. Berghede, I.D. Tommelein, Takt time planning for construction of exterior cladding, in: Proc. IGLC-21, Fortaleza, Brazil, 2013.</w:t>
       </w:r>
     </w:p>
     <w:p>
       <w:pPr>
-        <w:spacing w:after="80"/>
+        <w:spacing w:after="60"/>
         <w:ind w:left="425" w:hanging="425"/>
       </w:pPr>
       <w:r>
@@ -1812,7 +2274,7 @@
     </w:p>
     <w:p>
       <w:pPr>
-        <w:spacing w:after="80"/>
+        <w:spacing w:after="60"/>
         <w:ind w:left="425" w:hanging="425"/>
       </w:pPr>
       <w:r>
@@ -1822,12 +2284,12 @@
           <w:i w:val="0"/>
           <w:sz w:val="18"/>
         </w:rPr>
-        <w:t>[7] J.F.C. Kingman, The single server queue in heavy traffic, Math. Proc. Cambridge Philos. Soc. 57 (4) (1961) 902–904. https://doi.org/10.1017/S0305004100036094</w:t>
+        <w:t>[7] J.F.C. Kingman, The single server queue in heavy traffic, Math. Proc. Cambridge Philos. Soc. 57 (4) (1961) 902–904.</w:t>
       </w:r>
     </w:p>
     <w:p>
       <w:pPr>
-        <w:spacing w:after="80"/>
+        <w:spacing w:after="60"/>
         <w:ind w:left="425" w:hanging="425"/>
       </w:pPr>
       <w:r>
@@ -1837,12 +2299,12 @@
           <w:i w:val="0"/>
           <w:sz w:val="18"/>
         </w:rPr>
-        <w:t>[8] [PLACEHOLDER — Peer-reviewed article that used Parade Tim Kerja; full citation with DOI. Required for Software Impacts.]</w:t>
+        <w:t>[8] [PLACEHOLDER — Peer-reviewed article that used Parade Tim Kerja; full citation with DOI.]</w:t>
       </w:r>
     </w:p>
     <w:p>
       <w:pPr>
-        <w:spacing w:after="80"/>
+        <w:spacing w:after="60"/>
         <w:ind w:left="425" w:hanging="425"/>
       </w:pPr>
       <w:r>
@@ -1853,6 +2315,21 @@
           <w:sz w:val="18"/>
         </w:rPr>
         <w:t>[9] Lean Built, Is takt really magic? https://leanbuilt.us/is-takt-really-magic/ (accessed 5 August 2026).</w:t>
+      </w:r>
+    </w:p>
+    <w:p>
+      <w:pPr>
+        <w:spacing w:after="60"/>
+        <w:ind w:left="425" w:hanging="425"/>
+      </w:pPr>
+      <w:r>
+        <w:rPr>
+          <w:rFonts w:ascii="Times New Roman" w:hAnsi="Times New Roman" w:eastAsia="Times New Roman"/>
+          <w:b w:val="0"/>
+          <w:i w:val="0"/>
+          <w:sz w:val="18"/>
+        </w:rPr>
+        <w:t>[10] H.J. Choo, I.D. Tommelein, Parade of Trades: A Computer Game for Understanding Variability and Dependence, Technical Report 99-1, Construction Engineering and Management Program, Department of Civil and Environmental Engineering, University of California, Berkeley, September 1999. http://p2sl.berkeley.edu/wp-content/uploads/2020/03/Choo_Tommelein_1999_Parade_of_Trades.pdf</w:t>
       </w:r>
     </w:p>
     <w:p>
@@ -1871,7 +2348,7 @@
           <w:i w:val="0"/>
           <w:sz w:val="24"/>
         </w:rPr>
-        <w:t>Author notes (not for journal PDF)</w:t>
+        <w:t>Author notes (remove before submission)</w:t>
       </w:r>
     </w:p>
     <w:p>
@@ -1885,7 +2362,7 @@
           <w:i w:val="0"/>
           <w:sz w:val="20"/>
         </w:rPr>
-        <w:t>1. Copy-paste or open this DOCX alongside Elsevier’s official SIMPAC_OSP_Template.docx and merge into the official styles if the editorial system requires the branded template.</w:t>
+        <w:t>Section 1.1–1.2 and Table 2 state lineage from Tommelein Parade of Trades and differentiation/strengths.</w:t>
       </w:r>
     </w:p>
     <w:p>
@@ -1899,7 +2376,7 @@
           <w:i w:val="0"/>
           <w:sz w:val="20"/>
         </w:rPr>
-        <w:t>2. Submit Highlights as a separate file (see SOFTWARE_IMPACTS_HIGHLIGHTS.txt in the repository).</w:t>
+        <w:t>Acknowledge [1] and [10] in Acknowledgements; do not imply endorsement by original authors unless obtained.</w:t>
       </w:r>
     </w:p>
     <w:p>
@@ -1913,49 +2390,7 @@
           <w:i w:val="0"/>
           <w:sz w:val="20"/>
         </w:rPr>
-        <w:t>3. Add an OSI-approved LICENSE file to the GitHub repository and release a version tag (e.g. v1.0.0) before submission.</w:t>
-      </w:r>
-    </w:p>
-    <w:p>
-      <w:pPr>
-        <w:spacing w:after="80" w:before="0" w:line="276" w:lineRule="auto"/>
-      </w:pPr>
-      <w:r>
-        <w:rPr>
-          <w:rFonts w:ascii="Times New Roman" w:hAnsi="Times New Roman" w:eastAsia="Times New Roman"/>
-          <w:b w:val="0"/>
-          <w:i w:val="0"/>
-          <w:sz w:val="20"/>
-        </w:rPr>
-        <w:t>4. Complete Section 3 Impact Overview with real course/workshop numbers and at least one peer-reviewed citation in [8].</w:t>
-      </w:r>
-    </w:p>
-    <w:p>
-      <w:pPr>
-        <w:spacing w:after="80" w:before="0" w:line="276" w:lineRule="auto"/>
-      </w:pPr>
-      <w:r>
-        <w:rPr>
-          <w:rFonts w:ascii="Times New Roman" w:hAnsi="Times New Roman" w:eastAsia="Times New Roman"/>
-          <w:b w:val="0"/>
-          <w:i w:val="0"/>
-          <w:sz w:val="20"/>
-        </w:rPr>
-        <w:t>5. Replace Figure placeholders with high-resolution screenshots (≥300 dpi).</w:t>
-      </w:r>
-    </w:p>
-    <w:p>
-      <w:pPr>
-        <w:spacing w:after="80" w:before="0" w:line="276" w:lineRule="auto"/>
-      </w:pPr>
-      <w:r>
-        <w:rPr>
-          <w:rFonts w:ascii="Times New Roman" w:hAnsi="Times New Roman" w:eastAsia="Times New Roman"/>
-          <w:b w:val="0"/>
-          <w:i w:val="0"/>
-          <w:sz w:val="20"/>
-        </w:rPr>
-        <w:t>6. Fill all [PLACEHOLDER] fields and remove this ‘Author notes’ page before final upload.</w:t>
+        <w:t>Complete Impact Overview [8], OSI licence, Streamlit URL, figures, and author names.</w:t>
       </w:r>
     </w:p>
     <w:sectPr>

</xml_diff>